<commit_message>
Cambios en el tipo de atributos, nombre, en el propio código DDL y eliminación de las tablas 'rol', 'permiso' y su respectiva tabla intermedia (N:M).
</commit_message>
<xml_diff>
--- a/Especificaciones_Tecnicas_Previas.docx
+++ b/Especificaciones_Tecnicas_Previas.docx
@@ -5836,10 +5836,7 @@
               <w:t xml:space="preserve"> </w:t>
             </w:r>
             <w:r>
-              <w:t>i</w:t>
-            </w:r>
-            <w:r>
-              <w:t>ndica</w:t>
+              <w:t>empleado</w:t>
             </w:r>
           </w:p>
         </w:tc>
@@ -5859,7 +5856,7 @@
             </w:r>
             <w:proofErr w:type="spellStart"/>
             <w:r>
-              <w:t>id_rol</w:t>
+              <w:t>dni_persona</w:t>
             </w:r>
             <w:proofErr w:type="spellEnd"/>
           </w:p>
@@ -5876,29 +5873,26 @@
           </w:tcPr>
           <w:p>
             <w:r>
+              <w:t xml:space="preserve"> persona</w:t>
+            </w:r>
+          </w:p>
+        </w:tc>
+        <w:tc>
+          <w:tcPr>
+            <w:tcW w:w="2600" w:type="dxa"/>
+            <w:tcMar>
+              <w:top w:w="200" w:type="dxa"/>
+              <w:left w:w="100" w:type="dxa"/>
+              <w:bottom w:w="200" w:type="dxa"/>
+              <w:right w:w="100" w:type="dxa"/>
+            </w:tcMar>
+          </w:tcPr>
+          <w:p>
+            <w:r>
               <w:t xml:space="preserve"> </w:t>
             </w:r>
             <w:r>
-              <w:t>r</w:t>
-            </w:r>
-            <w:r>
-              <w:t>ol</w:t>
-            </w:r>
-          </w:p>
-        </w:tc>
-        <w:tc>
-          <w:tcPr>
-            <w:tcW w:w="2600" w:type="dxa"/>
-            <w:tcMar>
-              <w:top w:w="200" w:type="dxa"/>
-              <w:left w:w="100" w:type="dxa"/>
-              <w:bottom w:w="200" w:type="dxa"/>
-              <w:right w:w="100" w:type="dxa"/>
-            </w:tcMar>
-          </w:tcPr>
-          <w:p>
-            <w:r>
-              <w:t xml:space="preserve"> AMBAS</w:t>
+              <w:t>AMBAS</w:t>
             </w:r>
           </w:p>
         </w:tc>
@@ -5919,10 +5913,7 @@
               <w:t xml:space="preserve"> </w:t>
             </w:r>
             <w:r>
-              <w:t>i</w:t>
-            </w:r>
-            <w:r>
-              <w:t>ndica</w:t>
+              <w:t>empleado</w:t>
             </w:r>
           </w:p>
         </w:tc>
@@ -5942,7 +5933,7 @@
             </w:r>
             <w:proofErr w:type="spellStart"/>
             <w:r>
-              <w:t>id_permiso</w:t>
+              <w:t>id_rol</w:t>
             </w:r>
             <w:proofErr w:type="spellEnd"/>
           </w:p>
@@ -5959,13 +5950,7 @@
           </w:tcPr>
           <w:p>
             <w:r>
-              <w:t xml:space="preserve"> </w:t>
-            </w:r>
-            <w:r>
-              <w:t>p</w:t>
-            </w:r>
-            <w:r>
-              <w:t>ermiso</w:t>
+              <w:t xml:space="preserve"> rol</w:t>
             </w:r>
           </w:p>
         </w:tc>
@@ -5981,10 +5966,7 @@
           </w:tcPr>
           <w:p>
             <w:r>
-              <w:t xml:space="preserve"> </w:t>
-            </w:r>
-            <w:r>
-              <w:t>AMBAS</w:t>
+              <w:t xml:space="preserve"> ON UPDATE</w:t>
             </w:r>
           </w:p>
         </w:tc>
@@ -6005,7 +5987,7 @@
               <w:t xml:space="preserve"> </w:t>
             </w:r>
             <w:r>
-              <w:t>empleado</w:t>
+              <w:t>reserva</w:t>
             </w:r>
           </w:p>
         </w:tc>
@@ -6025,7 +6007,7 @@
             </w:r>
             <w:proofErr w:type="spellStart"/>
             <w:r>
-              <w:t>dni</w:t>
+              <w:t>dni_persona</w:t>
             </w:r>
             <w:proofErr w:type="spellEnd"/>
           </w:p>
@@ -6042,7 +6024,10 @@
           </w:tcPr>
           <w:p>
             <w:r>
-              <w:t xml:space="preserve"> persona</w:t>
+              <w:t xml:space="preserve"> </w:t>
+            </w:r>
+            <w:r>
+              <w:t>persona</w:t>
             </w:r>
           </w:p>
         </w:tc>
@@ -6061,7 +6046,7 @@
               <w:t xml:space="preserve"> </w:t>
             </w:r>
             <w:r>
-              <w:t>AMBAS</w:t>
+              <w:t>ON UPDATE</w:t>
             </w:r>
           </w:p>
         </w:tc>
@@ -6079,7 +6064,10 @@
           </w:tcPr>
           <w:p>
             <w:r>
-              <w:t>empleado</w:t>
+              <w:t xml:space="preserve"> </w:t>
+            </w:r>
+            <w:r>
+              <w:t>reserva</w:t>
             </w:r>
           </w:p>
         </w:tc>
@@ -6099,7 +6087,7 @@
             </w:r>
             <w:proofErr w:type="spellStart"/>
             <w:r>
-              <w:t>id_rol</w:t>
+              <w:t>nro_sala</w:t>
             </w:r>
             <w:proofErr w:type="spellEnd"/>
           </w:p>
@@ -6116,7 +6104,10 @@
           </w:tcPr>
           <w:p>
             <w:r>
-              <w:t xml:space="preserve"> rol</w:t>
+              <w:t xml:space="preserve"> </w:t>
+            </w:r>
+            <w:r>
+              <w:t>sala</w:t>
             </w:r>
           </w:p>
         </w:tc>
@@ -6132,7 +6123,10 @@
           </w:tcPr>
           <w:p>
             <w:r>
-              <w:t xml:space="preserve"> ON UPDATE</w:t>
+              <w:t xml:space="preserve"> </w:t>
+            </w:r>
+            <w:r>
+              <w:t>ON UPDATE</w:t>
             </w:r>
           </w:p>
         </w:tc>
@@ -6153,7 +6147,7 @@
               <w:t xml:space="preserve"> </w:t>
             </w:r>
             <w:r>
-              <w:t>reserva</w:t>
+              <w:t>pago</w:t>
             </w:r>
           </w:p>
         </w:tc>
@@ -6173,7 +6167,7 @@
             </w:r>
             <w:proofErr w:type="spellStart"/>
             <w:r>
-              <w:t>dni_persona</w:t>
+              <w:t>nro_reserva</w:t>
             </w:r>
             <w:proofErr w:type="spellEnd"/>
           </w:p>
@@ -6190,10 +6184,7 @@
           </w:tcPr>
           <w:p>
             <w:r>
-              <w:t xml:space="preserve"> </w:t>
-            </w:r>
-            <w:r>
-              <w:t>persona</w:t>
+              <w:t xml:space="preserve"> reserva</w:t>
             </w:r>
           </w:p>
         </w:tc>
@@ -6209,10 +6200,7 @@
           </w:tcPr>
           <w:p>
             <w:r>
-              <w:t xml:space="preserve"> </w:t>
-            </w:r>
-            <w:r>
-              <w:t>ON UPDATE</w:t>
+              <w:t xml:space="preserve"> ON UPDATE</w:t>
             </w:r>
           </w:p>
         </w:tc>
@@ -6232,9 +6220,11 @@
             <w:r>
               <w:t xml:space="preserve"> </w:t>
             </w:r>
-            <w:r>
-              <w:t>reserva</w:t>
-            </w:r>
+            <w:proofErr w:type="spellStart"/>
+            <w:r>
+              <w:t>reserva_inventario</w:t>
+            </w:r>
+            <w:proofErr w:type="spellEnd"/>
           </w:p>
         </w:tc>
         <w:tc>
@@ -6253,7 +6243,7 @@
             </w:r>
             <w:proofErr w:type="spellStart"/>
             <w:r>
-              <w:t>nro_sala</w:t>
+              <w:t>nro_reserva</w:t>
             </w:r>
             <w:proofErr w:type="spellEnd"/>
           </w:p>
@@ -6270,29 +6260,26 @@
           </w:tcPr>
           <w:p>
             <w:r>
+              <w:t xml:space="preserve"> reserva</w:t>
+            </w:r>
+          </w:p>
+        </w:tc>
+        <w:tc>
+          <w:tcPr>
+            <w:tcW w:w="2600" w:type="dxa"/>
+            <w:tcMar>
+              <w:top w:w="200" w:type="dxa"/>
+              <w:left w:w="100" w:type="dxa"/>
+              <w:bottom w:w="200" w:type="dxa"/>
+              <w:right w:w="100" w:type="dxa"/>
+            </w:tcMar>
+          </w:tcPr>
+          <w:p>
+            <w:r>
               <w:t xml:space="preserve"> </w:t>
             </w:r>
             <w:r>
-              <w:t>sala</w:t>
-            </w:r>
-          </w:p>
-        </w:tc>
-        <w:tc>
-          <w:tcPr>
-            <w:tcW w:w="2600" w:type="dxa"/>
-            <w:tcMar>
-              <w:top w:w="200" w:type="dxa"/>
-              <w:left w:w="100" w:type="dxa"/>
-              <w:bottom w:w="200" w:type="dxa"/>
-              <w:right w:w="100" w:type="dxa"/>
-            </w:tcMar>
-          </w:tcPr>
-          <w:p>
-            <w:r>
-              <w:t xml:space="preserve"> </w:t>
-            </w:r>
-            <w:r>
-              <w:t>ON UPDATE</w:t>
+              <w:t>AMBAS</w:t>
             </w:r>
           </w:p>
         </w:tc>
@@ -6311,8 +6298,13 @@
           <w:p>
             <w:r>
               <w:lastRenderedPageBreak/>
-              <w:t>pago</w:t>
-            </w:r>
+              <w:t xml:space="preserve"> </w:t>
+            </w:r>
+            <w:proofErr w:type="spellStart"/>
+            <w:r>
+              <w:t>reserva_inventario</w:t>
+            </w:r>
+            <w:proofErr w:type="spellEnd"/>
           </w:p>
         </w:tc>
         <w:tc>
@@ -6331,7 +6323,7 @@
             </w:r>
             <w:proofErr w:type="spellStart"/>
             <w:r>
-              <w:t>nro_reserva</w:t>
+              <w:t>id_item_inventario</w:t>
             </w:r>
             <w:proofErr w:type="spellEnd"/>
           </w:p>
@@ -6348,8 +6340,13 @@
           </w:tcPr>
           <w:p>
             <w:r>
-              <w:t xml:space="preserve"> reserva</w:t>
-            </w:r>
+              <w:t xml:space="preserve"> </w:t>
+            </w:r>
+            <w:proofErr w:type="spellStart"/>
+            <w:r>
+              <w:t>item_inventario</w:t>
+            </w:r>
+            <w:proofErr w:type="spellEnd"/>
           </w:p>
         </w:tc>
         <w:tc>
@@ -6382,8 +6379,13 @@
           </w:tcPr>
           <w:p>
             <w:r>
-              <w:t xml:space="preserve"> aparta</w:t>
-            </w:r>
+              <w:t xml:space="preserve"> </w:t>
+            </w:r>
+            <w:proofErr w:type="spellStart"/>
+            <w:r>
+              <w:t>ítem_inventario</w:t>
+            </w:r>
+            <w:proofErr w:type="spellEnd"/>
           </w:p>
         </w:tc>
         <w:tc>
@@ -6402,7 +6404,7 @@
             </w:r>
             <w:proofErr w:type="spellStart"/>
             <w:r>
-              <w:t>nro_reserva</w:t>
+              <w:t>id_categoria</w:t>
             </w:r>
             <w:proofErr w:type="spellEnd"/>
           </w:p>
@@ -6419,7 +6421,7 @@
           </w:tcPr>
           <w:p>
             <w:r>
-              <w:t xml:space="preserve"> reserva</w:t>
+              <w:t xml:space="preserve"> categoría</w:t>
             </w:r>
           </w:p>
         </w:tc>
@@ -6435,10 +6437,7 @@
           </w:tcPr>
           <w:p>
             <w:r>
-              <w:t xml:space="preserve"> </w:t>
-            </w:r>
-            <w:r>
-              <w:t>AMBAS</w:t>
+              <w:t xml:space="preserve"> ON UPDATE</w:t>
             </w:r>
           </w:p>
         </w:tc>
@@ -6456,8 +6455,13 @@
           </w:tcPr>
           <w:p>
             <w:r>
-              <w:t xml:space="preserve"> aparta</w:t>
-            </w:r>
+              <w:t xml:space="preserve"> </w:t>
+            </w:r>
+            <w:proofErr w:type="spellStart"/>
+            <w:r>
+              <w:t>ítem_inventario</w:t>
+            </w:r>
+            <w:proofErr w:type="spellEnd"/>
           </w:p>
         </w:tc>
         <w:tc>
@@ -6476,7 +6480,7 @@
             </w:r>
             <w:proofErr w:type="spellStart"/>
             <w:r>
-              <w:t>id_item_inventario</w:t>
+              <w:t>id_fabricante</w:t>
             </w:r>
             <w:proofErr w:type="spellEnd"/>
           </w:p>
@@ -6493,13 +6497,8 @@
           </w:tcPr>
           <w:p>
             <w:r>
-              <w:t xml:space="preserve"> </w:t>
-            </w:r>
-            <w:proofErr w:type="spellStart"/>
-            <w:r>
-              <w:t>item_inventario</w:t>
-            </w:r>
-            <w:proofErr w:type="spellEnd"/>
+              <w:t xml:space="preserve"> fabricante</w:t>
+            </w:r>
           </w:p>
         </w:tc>
         <w:tc>
@@ -6536,7 +6535,7 @@
             </w:r>
             <w:proofErr w:type="spellStart"/>
             <w:r>
-              <w:t>ítem_inventario</w:t>
+              <w:t>control_inventario</w:t>
             </w:r>
             <w:proofErr w:type="spellEnd"/>
           </w:p>
@@ -6557,7 +6556,10 @@
             </w:r>
             <w:proofErr w:type="spellStart"/>
             <w:r>
-              <w:t>id_categoria</w:t>
+              <w:t>dni</w:t>
+            </w:r>
+            <w:r>
+              <w:t>_empleado</w:t>
             </w:r>
             <w:proofErr w:type="spellEnd"/>
           </w:p>
@@ -6574,7 +6576,7 @@
           </w:tcPr>
           <w:p>
             <w:r>
-              <w:t xml:space="preserve"> categoría</w:t>
+              <w:t xml:space="preserve"> empleado</w:t>
             </w:r>
           </w:p>
         </w:tc>
@@ -6590,7 +6592,7 @@
           </w:tcPr>
           <w:p>
             <w:r>
-              <w:t xml:space="preserve"> ON UPDATE</w:t>
+              <w:t xml:space="preserve"> AMBAS</w:t>
             </w:r>
           </w:p>
         </w:tc>
@@ -6612,7 +6614,7 @@
             </w:r>
             <w:proofErr w:type="spellStart"/>
             <w:r>
-              <w:t>ítem_inventario</w:t>
+              <w:t>control_inventario</w:t>
             </w:r>
             <w:proofErr w:type="spellEnd"/>
           </w:p>
@@ -6633,7 +6635,10 @@
             </w:r>
             <w:proofErr w:type="spellStart"/>
             <w:r>
-              <w:t>id_fabricante</w:t>
+              <w:t>i</w:t>
+            </w:r>
+            <w:r>
+              <w:t>d_item_inventario</w:t>
             </w:r>
             <w:proofErr w:type="spellEnd"/>
           </w:p>
@@ -6650,8 +6655,16 @@
           </w:tcPr>
           <w:p>
             <w:r>
-              <w:t xml:space="preserve"> fabricante</w:t>
-            </w:r>
+              <w:t xml:space="preserve"> </w:t>
+            </w:r>
+            <w:proofErr w:type="spellStart"/>
+            <w:r>
+              <w:t>i</w:t>
+            </w:r>
+            <w:r>
+              <w:t>tem_inventario</w:t>
+            </w:r>
+            <w:proofErr w:type="spellEnd"/>
           </w:p>
         </w:tc>
         <w:tc>
@@ -6666,7 +6679,7 @@
           </w:tcPr>
           <w:p>
             <w:r>
-              <w:t xml:space="preserve"> ON UPDATE</w:t>
+              <w:t xml:space="preserve"> AMBAS</w:t>
             </w:r>
           </w:p>
         </w:tc>
@@ -6688,7 +6701,7 @@
             </w:r>
             <w:proofErr w:type="spellStart"/>
             <w:r>
-              <w:t>control_inventario</w:t>
+              <w:t>categoria</w:t>
             </w:r>
             <w:proofErr w:type="spellEnd"/>
           </w:p>
@@ -6709,10 +6722,7 @@
             </w:r>
             <w:proofErr w:type="spellStart"/>
             <w:r>
-              <w:t>dni</w:t>
-            </w:r>
-            <w:r>
-              <w:t>_empleado</w:t>
+              <w:t>id_categoria_padre</w:t>
             </w:r>
             <w:proofErr w:type="spellEnd"/>
           </w:p>
@@ -6729,8 +6739,13 @@
           </w:tcPr>
           <w:p>
             <w:r>
-              <w:t xml:space="preserve"> empleado</w:t>
-            </w:r>
+              <w:t xml:space="preserve"> </w:t>
+            </w:r>
+            <w:proofErr w:type="spellStart"/>
+            <w:r>
+              <w:t>categoria</w:t>
+            </w:r>
+            <w:proofErr w:type="spellEnd"/>
           </w:p>
         </w:tc>
         <w:tc>
@@ -6745,97 +6760,8 @@
           </w:tcPr>
           <w:p>
             <w:r>
-              <w:t xml:space="preserve"> AMBAS</w:t>
-            </w:r>
-          </w:p>
-        </w:tc>
-      </w:tr>
-      <w:tr>
-        <w:tc>
-          <w:tcPr>
-            <w:tcW w:w="2000" w:type="dxa"/>
-            <w:tcMar>
-              <w:top w:w="200" w:type="dxa"/>
-              <w:left w:w="100" w:type="dxa"/>
-              <w:bottom w:w="200" w:type="dxa"/>
-              <w:right w:w="100" w:type="dxa"/>
-            </w:tcMar>
-          </w:tcPr>
-          <w:p>
-            <w:r>
-              <w:t xml:space="preserve"> </w:t>
-            </w:r>
-            <w:proofErr w:type="spellStart"/>
-            <w:r>
-              <w:t>control_inventario</w:t>
-            </w:r>
-            <w:proofErr w:type="spellEnd"/>
-          </w:p>
-        </w:tc>
-        <w:tc>
-          <w:tcPr>
-            <w:tcW w:w="2200" w:type="dxa"/>
-            <w:tcMar>
-              <w:top w:w="200" w:type="dxa"/>
-              <w:left w:w="100" w:type="dxa"/>
-              <w:bottom w:w="200" w:type="dxa"/>
-              <w:right w:w="100" w:type="dxa"/>
-            </w:tcMar>
-          </w:tcPr>
-          <w:p>
-            <w:r>
-              <w:t xml:space="preserve"> </w:t>
-            </w:r>
-            <w:proofErr w:type="spellStart"/>
-            <w:r>
-              <w:t>i</w:t>
-            </w:r>
-            <w:r>
-              <w:t>d_item_inventario</w:t>
-            </w:r>
-            <w:proofErr w:type="spellEnd"/>
-          </w:p>
-        </w:tc>
-        <w:tc>
-          <w:tcPr>
-            <w:tcW w:w="2200" w:type="dxa"/>
-            <w:tcMar>
-              <w:top w:w="200" w:type="dxa"/>
-              <w:left w:w="100" w:type="dxa"/>
-              <w:bottom w:w="200" w:type="dxa"/>
-              <w:right w:w="100" w:type="dxa"/>
-            </w:tcMar>
-          </w:tcPr>
-          <w:p>
-            <w:r>
-              <w:t xml:space="preserve"> </w:t>
-            </w:r>
-            <w:proofErr w:type="spellStart"/>
-            <w:r>
-              <w:t>i</w:t>
-            </w:r>
-            <w:r>
-              <w:t>tem_inventario</w:t>
-            </w:r>
-            <w:proofErr w:type="spellEnd"/>
-          </w:p>
-        </w:tc>
-        <w:tc>
-          <w:tcPr>
-            <w:tcW w:w="2600" w:type="dxa"/>
-            <w:tcMar>
-              <w:top w:w="200" w:type="dxa"/>
-              <w:left w:w="100" w:type="dxa"/>
-              <w:bottom w:w="200" w:type="dxa"/>
-              <w:right w:w="100" w:type="dxa"/>
-            </w:tcMar>
-          </w:tcPr>
-          <w:p>
-            <w:r>
-              <w:t xml:space="preserve"> AMBAS</w:t>
-            </w:r>
-            <w:bookmarkStart w:id="22" w:name="_GoBack"/>
-            <w:bookmarkEnd w:id="22"/>
+              <w:t xml:space="preserve"> ON UPDATE</w:t>
+            </w:r>
           </w:p>
         </w:tc>
       </w:tr>
@@ -6845,11 +6771,11 @@
       <w:pPr>
         <w:pStyle w:val="Ttulo1"/>
       </w:pPr>
-      <w:bookmarkStart w:id="23" w:name="_Toc239078840"/>
+      <w:bookmarkStart w:id="22" w:name="_Toc239078840"/>
       <w:r>
         <w:t>6. Modelo Conceptual</w:t>
       </w:r>
-      <w:bookmarkEnd w:id="23"/>
+      <w:bookmarkEnd w:id="22"/>
     </w:p>
     <w:p>
       <w:pPr>
@@ -6968,24 +6894,20 @@
     </w:p>
     <w:p>
       <w:pPr>
-        <w:pBdr>
-          <w:top w:val="dashed" w:sz="6" w:space="0" w:color="999999"/>
-          <w:left w:val="dashed" w:sz="6" w:space="0" w:color="999999"/>
-          <w:bottom w:val="dashed" w:sz="6" w:space="0" w:color="999999"/>
-          <w:right w:val="dashed" w:sz="6" w:space="0" w:color="999999"/>
-        </w:pBdr>
-        <w:spacing w:before="400" w:after="400"/>
-        <w:jc w:val="center"/>
-      </w:pPr>
+        <w:spacing w:after="200"/>
+      </w:pPr>
+      <w:r>
+        <w:t xml:space="preserve"> </w:t>
+      </w:r>
       <w:r>
         <w:rPr>
           <w:noProof/>
         </w:rPr>
         <w:drawing>
-          <wp:inline distT="0" distB="0" distL="0" distR="0" wp14:anchorId="49BCCBDC" wp14:editId="6AE59029">
-            <wp:extent cx="6120130" cy="3020324"/>
-            <wp:effectExtent l="0" t="0" r="0" b="8890"/>
-            <wp:docPr id="1" name="Imagen 1" descr="C:\Users\sanch\OneDrive\Imágenes\Capturas de pantalla\Captura de pantalla 2026-10-07 190943.png"/>
+          <wp:inline distT="0" distB="0" distL="0" distR="0" wp14:anchorId="6FF53AC3" wp14:editId="2DDC492C">
+            <wp:extent cx="6120130" cy="4140478"/>
+            <wp:effectExtent l="0" t="0" r="0" b="0"/>
+            <wp:docPr id="2" name="Imagen 2" descr="C:\Users\sanch\OneDrive\Imágenes\Capturas de pantalla\Captura de pantalla 2026-10-14 173250.png"/>
             <wp:cNvGraphicFramePr>
               <a:graphicFrameLocks xmlns:a="http://schemas.openxmlformats.org/drawingml/2006/main" noChangeAspect="1"/>
             </wp:cNvGraphicFramePr>
@@ -6993,7 +6915,7 @@
               <a:graphicData uri="http://schemas.openxmlformats.org/drawingml/2006/picture">
                 <pic:pic xmlns:pic="http://schemas.openxmlformats.org/drawingml/2006/picture">
                   <pic:nvPicPr>
-                    <pic:cNvPr id="0" name="Picture 1" descr="C:\Users\sanch\OneDrive\Imágenes\Capturas de pantalla\Captura de pantalla 2026-10-07 190943.png"/>
+                    <pic:cNvPr id="0" name="Picture 1" descr="C:\Users\sanch\OneDrive\Imágenes\Capturas de pantalla\Captura de pantalla 2026-10-14 173250.png"/>
                     <pic:cNvPicPr>
                       <a:picLocks noChangeAspect="1" noChangeArrowheads="1"/>
                     </pic:cNvPicPr>
@@ -7014,7 +6936,7 @@
                   <pic:spPr bwMode="auto">
                     <a:xfrm>
                       <a:off x="0" y="0"/>
-                      <a:ext cx="6120130" cy="3020324"/>
+                      <a:ext cx="6120130" cy="4140478"/>
                     </a:xfrm>
                     <a:prstGeom prst="rect">
                       <a:avLst/>
@@ -7030,25 +6952,19 @@
           </wp:inline>
         </w:drawing>
       </w:r>
-      <w:r>
-        <w:t xml:space="preserve"> </w:t>
-      </w:r>
-    </w:p>
-    <w:p>
-      <w:r>
-        <w:br w:type="page"/>
-      </w:r>
-    </w:p>
+    </w:p>
+    <w:p/>
+    <w:p/>
     <w:p>
       <w:pPr>
         <w:pStyle w:val="Ttulo1"/>
       </w:pPr>
-      <w:bookmarkStart w:id="24" w:name="_Toc239078841"/>
+      <w:bookmarkStart w:id="23" w:name="_Toc239078841"/>
       <w:r>
         <w:lastRenderedPageBreak/>
         <w:t>7. Modelo Lógico</w:t>
       </w:r>
-      <w:bookmarkEnd w:id="24"/>
+      <w:bookmarkEnd w:id="23"/>
     </w:p>
     <w:p>
       <w:pPr>
@@ -7259,7 +7175,7 @@
               <w:t xml:space="preserve"> </w:t>
             </w:r>
             <w:r>
-              <w:t>indica [relación N:M]</w:t>
+              <w:t>reserva [entidad]</w:t>
             </w:r>
           </w:p>
         </w:tc>
@@ -7278,7 +7194,7 @@
               <w:t xml:space="preserve"> </w:t>
             </w:r>
             <w:r>
-              <w:t>indica</w:t>
+              <w:t>reserva</w:t>
             </w:r>
           </w:p>
         </w:tc>
@@ -7297,54 +7213,31 @@
               <w:t xml:space="preserve"> </w:t>
             </w:r>
             <w:r>
-              <w:t>U</w:t>
-            </w:r>
-            <w:r>
-              <w:t>nión</w:t>
-            </w:r>
-            <w:r>
-              <w:t xml:space="preserve"> con</w:t>
-            </w:r>
-            <w:r>
-              <w:t xml:space="preserve"> base </w:t>
-            </w:r>
-            <w:r>
-              <w:t>en</w:t>
-            </w:r>
-            <w:r>
-              <w:t xml:space="preserve"> las </w:t>
+              <w:t xml:space="preserve">Recibimiento de </w:t>
             </w:r>
             <w:proofErr w:type="spellStart"/>
             <w:r>
-              <w:t>FKs</w:t>
+              <w:rPr>
+                <w:b/>
+              </w:rPr>
+              <w:t>nro_sala</w:t>
             </w:r>
             <w:proofErr w:type="spellEnd"/>
             <w:r>
-              <w:t xml:space="preserve"> </w:t>
+              <w:t xml:space="preserve"> y </w:t>
             </w:r>
             <w:proofErr w:type="spellStart"/>
             <w:r>
               <w:rPr>
                 <w:b/>
               </w:rPr>
-              <w:t>id_rol</w:t>
-            </w:r>
-            <w:proofErr w:type="spellEnd"/>
+              <w:t>dni_</w:t>
+            </w:r>
             <w:r>
               <w:rPr>
                 <w:b/>
               </w:rPr>
-              <w:t xml:space="preserve"> </w:t>
-            </w:r>
-            <w:r>
-              <w:t xml:space="preserve">e </w:t>
-            </w:r>
-            <w:proofErr w:type="spellStart"/>
-            <w:r>
-              <w:rPr>
-                <w:b/>
-              </w:rPr>
-              <w:t>id_permiso</w:t>
+              <w:t>persona</w:t>
             </w:r>
             <w:proofErr w:type="spellEnd"/>
             <w:r>
@@ -7369,7 +7262,7 @@
               <w:t xml:space="preserve"> </w:t>
             </w:r>
             <w:r>
-              <w:t>reserva [entidad]</w:t>
+              <w:t>anota [relación 1:1]</w:t>
             </w:r>
           </w:p>
         </w:tc>
@@ -7388,7 +7281,7 @@
               <w:t xml:space="preserve"> </w:t>
             </w:r>
             <w:r>
-              <w:t>reserva</w:t>
+              <w:t>pago</w:t>
             </w:r>
           </w:p>
         </w:tc>
@@ -7407,27 +7300,22 @@
               <w:t xml:space="preserve"> </w:t>
             </w:r>
             <w:r>
-              <w:t xml:space="preserve">Recibimiento de </w:t>
+              <w:t>Se u</w:t>
+            </w:r>
+            <w:r>
+              <w:t xml:space="preserve">sa como FK el </w:t>
             </w:r>
             <w:proofErr w:type="spellStart"/>
             <w:r>
               <w:rPr>
                 <w:b/>
               </w:rPr>
-              <w:t>nro_sala</w:t>
+              <w:t>nro_reserva</w:t>
             </w:r>
             <w:proofErr w:type="spellEnd"/>
             <w:r>
-              <w:t xml:space="preserve"> y </w:t>
-            </w:r>
-            <w:proofErr w:type="spellStart"/>
-            <w:r>
-              <w:rPr>
-                <w:b/>
-              </w:rPr>
-              <w:t>dni_cliente</w:t>
-            </w:r>
-            <w:proofErr w:type="spellEnd"/>
+              <w:t>, así sabiendo su origen</w:t>
+            </w:r>
             <w:r>
               <w:t>.</w:t>
             </w:r>
@@ -7449,8 +7337,13 @@
             <w:r>
               <w:t xml:space="preserve"> </w:t>
             </w:r>
-            <w:r>
-              <w:t>anota [relación 1:1]</w:t>
+            <w:proofErr w:type="spellStart"/>
+            <w:r>
+              <w:t>ítem_inventario</w:t>
+            </w:r>
+            <w:proofErr w:type="spellEnd"/>
+            <w:r>
+              <w:t xml:space="preserve"> [entidad]</w:t>
             </w:r>
           </w:p>
         </w:tc>
@@ -7468,9 +7361,11 @@
             <w:r>
               <w:t xml:space="preserve"> </w:t>
             </w:r>
-            <w:r>
-              <w:t>pago</w:t>
-            </w:r>
+            <w:proofErr w:type="spellStart"/>
+            <w:r>
+              <w:t>ítem_inventario</w:t>
+            </w:r>
+            <w:proofErr w:type="spellEnd"/>
           </w:p>
         </w:tc>
         <w:tc>
@@ -7485,25 +7380,33 @@
           </w:tcPr>
           <w:p>
             <w:r>
+              <w:t xml:space="preserve"> Recibe tanto la FK </w:t>
+            </w:r>
+            <w:proofErr w:type="spellStart"/>
+            <w:r>
+              <w:rPr>
+                <w:b/>
+              </w:rPr>
+              <w:t>id_categoria</w:t>
+            </w:r>
+            <w:proofErr w:type="spellEnd"/>
+            <w:r>
+              <w:rPr>
+                <w:b/>
+              </w:rPr>
               <w:t xml:space="preserve"> </w:t>
             </w:r>
             <w:r>
-              <w:t>Se u</w:t>
-            </w:r>
-            <w:r>
-              <w:t xml:space="preserve">sa como FK el </w:t>
+              <w:t xml:space="preserve">como </w:t>
             </w:r>
             <w:proofErr w:type="spellStart"/>
             <w:r>
               <w:rPr>
                 <w:b/>
               </w:rPr>
-              <w:t>nro_reserva</w:t>
+              <w:t>id_fabricante</w:t>
             </w:r>
             <w:proofErr w:type="spellEnd"/>
-            <w:r>
-              <w:t>, así sabiendo su origen</w:t>
-            </w:r>
             <w:r>
               <w:t>.</w:t>
             </w:r>
@@ -7527,11 +7430,13 @@
             </w:r>
             <w:proofErr w:type="spellStart"/>
             <w:r>
-              <w:t>ítem_inventario</w:t>
+              <w:t>reserva_inventario</w:t>
             </w:r>
             <w:proofErr w:type="spellEnd"/>
-            <w:r>
-              <w:t xml:space="preserve"> [entidad]</w:t>
+          </w:p>
+          <w:p>
+            <w:r>
+              <w:t>[tabla intermedia (relación N:M)]</w:t>
             </w:r>
           </w:p>
         </w:tc>
@@ -7547,52 +7452,64 @@
           </w:tcPr>
           <w:p>
             <w:r>
+              <w:t xml:space="preserve"> aparta</w:t>
+            </w:r>
+          </w:p>
+        </w:tc>
+        <w:tc>
+          <w:tcPr>
+            <w:tcW w:w="3513" w:type="dxa"/>
+            <w:tcMar>
+              <w:top w:w="200" w:type="dxa"/>
+              <w:left w:w="100" w:type="dxa"/>
+              <w:bottom w:w="200" w:type="dxa"/>
+              <w:right w:w="100" w:type="dxa"/>
+            </w:tcMar>
+          </w:tcPr>
+          <w:p>
+            <w:r>
+              <w:t xml:space="preserve"> Tabla intermedia con PK propia (</w:t>
+            </w:r>
+            <w:r>
+              <w:rPr>
+                <w:b/>
+              </w:rPr>
+              <w:t>id</w:t>
+            </w:r>
+            <w:r>
+              <w:t xml:space="preserve">), a su vez recibiendo las </w:t>
+            </w:r>
+            <w:proofErr w:type="spellStart"/>
+            <w:r>
+              <w:t>FKs</w:t>
+            </w:r>
+            <w:proofErr w:type="spellEnd"/>
+            <w:r>
               <w:t xml:space="preserve"> </w:t>
             </w:r>
             <w:proofErr w:type="spellStart"/>
             <w:r>
-              <w:t>ítem_inventario</w:t>
+              <w:rPr>
+                <w:b/>
+              </w:rPr>
+              <w:t>nro_reserva</w:t>
             </w:r>
             <w:proofErr w:type="spellEnd"/>
-          </w:p>
-        </w:tc>
-        <w:tc>
-          <w:tcPr>
-            <w:tcW w:w="3513" w:type="dxa"/>
-            <w:tcMar>
-              <w:top w:w="200" w:type="dxa"/>
-              <w:left w:w="100" w:type="dxa"/>
-              <w:bottom w:w="200" w:type="dxa"/>
-              <w:right w:w="100" w:type="dxa"/>
-            </w:tcMar>
-          </w:tcPr>
-          <w:p>
-            <w:r>
-              <w:t xml:space="preserve"> Recibe tanto la FK </w:t>
+            <w:r>
+              <w:rPr>
+                <w:b/>
+              </w:rPr>
+              <w:t xml:space="preserve"> </w:t>
+            </w:r>
+            <w:r>
+              <w:t xml:space="preserve">e </w:t>
             </w:r>
             <w:proofErr w:type="spellStart"/>
             <w:r>
               <w:rPr>
                 <w:b/>
               </w:rPr>
-              <w:t>id_categoria</w:t>
-            </w:r>
-            <w:proofErr w:type="spellEnd"/>
-            <w:r>
-              <w:rPr>
-                <w:b/>
-              </w:rPr>
-              <w:t xml:space="preserve"> </w:t>
-            </w:r>
-            <w:r>
-              <w:t xml:space="preserve">como </w:t>
-            </w:r>
-            <w:proofErr w:type="spellStart"/>
-            <w:r>
-              <w:rPr>
-                <w:b/>
-              </w:rPr>
-              <w:t>id_fabricante</w:t>
+              <w:t>id_item_inventario</w:t>
             </w:r>
             <w:proofErr w:type="spellEnd"/>
             <w:r>
@@ -7614,7 +7531,20 @@
           </w:tcPr>
           <w:p>
             <w:r>
-              <w:t xml:space="preserve"> aparta [relación]</w:t>
+              <w:t xml:space="preserve"> </w:t>
+            </w:r>
+            <w:proofErr w:type="spellStart"/>
+            <w:r>
+              <w:t>c</w:t>
+            </w:r>
+            <w:r>
+              <w:t>ontrol_inventario</w:t>
+            </w:r>
+            <w:proofErr w:type="spellEnd"/>
+          </w:p>
+          <w:p>
+            <w:r>
+              <w:t>[tabla intermedia (relación N:M)]</w:t>
             </w:r>
           </w:p>
         </w:tc>
@@ -7630,8 +7560,13 @@
           </w:tcPr>
           <w:p>
             <w:r>
-              <w:t xml:space="preserve"> aparta</w:t>
-            </w:r>
+              <w:t xml:space="preserve"> </w:t>
+            </w:r>
+            <w:proofErr w:type="spellStart"/>
+            <w:r>
+              <w:t>control_inventario</w:t>
+            </w:r>
+            <w:proofErr w:type="spellEnd"/>
           </w:p>
         </w:tc>
         <w:tc>
@@ -7648,14 +7583,16 @@
             <w:r>
               <w:t xml:space="preserve"> Tabla intermedia con PK propia (</w:t>
             </w:r>
+            <w:proofErr w:type="spellStart"/>
             <w:r>
               <w:rPr>
                 <w:b/>
               </w:rPr>
-              <w:t>id</w:t>
-            </w:r>
-            <w:r>
-              <w:t xml:space="preserve">), a su vez recibiendo las </w:t>
+              <w:t>nro</w:t>
+            </w:r>
+            <w:proofErr w:type="spellEnd"/>
+            <w:r>
+              <w:t xml:space="preserve">), junto a las </w:t>
             </w:r>
             <w:proofErr w:type="spellStart"/>
             <w:r>
@@ -7670,7 +7607,13 @@
               <w:rPr>
                 <w:b/>
               </w:rPr>
-              <w:t>nro_reserva</w:t>
+              <w:t>dni</w:t>
+            </w:r>
+            <w:r>
+              <w:rPr>
+                <w:b/>
+              </w:rPr>
+              <w:t>_empleado</w:t>
             </w:r>
             <w:proofErr w:type="spellEnd"/>
             <w:r>
@@ -7709,114 +7652,6 @@
           </w:tcPr>
           <w:p>
             <w:r>
-              <w:t xml:space="preserve"> </w:t>
-            </w:r>
-            <w:proofErr w:type="spellStart"/>
-            <w:r>
-              <w:t>control_inventario</w:t>
-            </w:r>
-            <w:proofErr w:type="spellEnd"/>
-            <w:r>
-              <w:t xml:space="preserve"> [relación N:M]</w:t>
-            </w:r>
-          </w:p>
-        </w:tc>
-        <w:tc>
-          <w:tcPr>
-            <w:tcW w:w="2126" w:type="dxa"/>
-            <w:tcMar>
-              <w:top w:w="200" w:type="dxa"/>
-              <w:left w:w="100" w:type="dxa"/>
-              <w:bottom w:w="200" w:type="dxa"/>
-              <w:right w:w="100" w:type="dxa"/>
-            </w:tcMar>
-          </w:tcPr>
-          <w:p>
-            <w:r>
-              <w:t xml:space="preserve"> </w:t>
-            </w:r>
-            <w:proofErr w:type="spellStart"/>
-            <w:r>
-              <w:t>control_inventario</w:t>
-            </w:r>
-            <w:proofErr w:type="spellEnd"/>
-          </w:p>
-        </w:tc>
-        <w:tc>
-          <w:tcPr>
-            <w:tcW w:w="3513" w:type="dxa"/>
-            <w:tcMar>
-              <w:top w:w="200" w:type="dxa"/>
-              <w:left w:w="100" w:type="dxa"/>
-              <w:bottom w:w="200" w:type="dxa"/>
-              <w:right w:w="100" w:type="dxa"/>
-            </w:tcMar>
-          </w:tcPr>
-          <w:p>
-            <w:r>
-              <w:t xml:space="preserve"> Tabla intermedia con PK propia (</w:t>
-            </w:r>
-            <w:r>
-              <w:rPr>
-                <w:b/>
-              </w:rPr>
-              <w:t>id</w:t>
-            </w:r>
-            <w:r>
-              <w:t xml:space="preserve">), junto a las </w:t>
-            </w:r>
-            <w:proofErr w:type="spellStart"/>
-            <w:r>
-              <w:t>FKs</w:t>
-            </w:r>
-            <w:proofErr w:type="spellEnd"/>
-            <w:r>
-              <w:t xml:space="preserve"> </w:t>
-            </w:r>
-            <w:proofErr w:type="spellStart"/>
-            <w:r>
-              <w:rPr>
-                <w:b/>
-              </w:rPr>
-              <w:t>legajo_empleado</w:t>
-            </w:r>
-            <w:proofErr w:type="spellEnd"/>
-            <w:r>
-              <w:rPr>
-                <w:b/>
-              </w:rPr>
-              <w:t xml:space="preserve"> </w:t>
-            </w:r>
-            <w:r>
-              <w:t xml:space="preserve">e </w:t>
-            </w:r>
-            <w:proofErr w:type="spellStart"/>
-            <w:r>
-              <w:rPr>
-                <w:b/>
-              </w:rPr>
-              <w:t>id_item_inventario</w:t>
-            </w:r>
-            <w:proofErr w:type="spellEnd"/>
-            <w:r>
-              <w:t>.</w:t>
-            </w:r>
-          </w:p>
-        </w:tc>
-      </w:tr>
-      <w:tr>
-        <w:tc>
-          <w:tcPr>
-            <w:tcW w:w="3361" w:type="dxa"/>
-            <w:tcMar>
-              <w:top w:w="200" w:type="dxa"/>
-              <w:left w:w="100" w:type="dxa"/>
-              <w:bottom w:w="200" w:type="dxa"/>
-              <w:right w:w="100" w:type="dxa"/>
-            </w:tcMar>
-          </w:tcPr>
-          <w:p>
-            <w:r>
               <w:t xml:space="preserve"> contiene [relación 1:N]</w:t>
             </w:r>
           </w:p>
@@ -7889,12 +7724,12 @@
       <w:pPr>
         <w:pStyle w:val="Ttulo1"/>
       </w:pPr>
-      <w:bookmarkStart w:id="25" w:name="_Toc239078842"/>
+      <w:bookmarkStart w:id="24" w:name="_Toc239078842"/>
       <w:r>
         <w:lastRenderedPageBreak/>
         <w:t>8. Normalización</w:t>
       </w:r>
-      <w:bookmarkEnd w:id="25"/>
+      <w:bookmarkEnd w:id="24"/>
     </w:p>
     <w:p>
       <w:pPr>
@@ -8015,7 +7850,7 @@
       <w:pPr>
         <w:pStyle w:val="Ttulo1"/>
       </w:pPr>
-      <w:bookmarkStart w:id="26" w:name="_Toc239078843"/>
+      <w:bookmarkStart w:id="25" w:name="_Toc239078843"/>
       <w:r>
         <w:lastRenderedPageBreak/>
         <w:t xml:space="preserve">9. Modelo Físico — </w:t>
@@ -8024,18 +7859,18 @@
       <w:r>
         <w:t>MySQL</w:t>
       </w:r>
+      <w:bookmarkEnd w:id="25"/>
+      <w:proofErr w:type="spellEnd"/>
+    </w:p>
+    <w:p>
+      <w:pPr>
+        <w:pStyle w:val="Ttulo2"/>
+      </w:pPr>
+      <w:bookmarkStart w:id="26" w:name="_Toc239078844"/>
+      <w:r>
+        <w:t>9.1 Tipos de datos y restricciones</w:t>
+      </w:r>
       <w:bookmarkEnd w:id="26"/>
-      <w:proofErr w:type="spellEnd"/>
-    </w:p>
-    <w:p>
-      <w:pPr>
-        <w:pStyle w:val="Ttulo2"/>
-      </w:pPr>
-      <w:bookmarkStart w:id="27" w:name="_Toc239078844"/>
-      <w:r>
-        <w:t>9.1 Tipos de datos y restricciones</w:t>
-      </w:r>
-      <w:bookmarkEnd w:id="27"/>
     </w:p>
     <w:p>
       <w:pPr>
@@ -8124,11 +7959,11 @@
       <w:pPr>
         <w:pStyle w:val="Ttulo2"/>
       </w:pPr>
-      <w:bookmarkStart w:id="28" w:name="_Toc239078845"/>
+      <w:bookmarkStart w:id="27" w:name="_Toc239078845"/>
       <w:r>
         <w:t>9.2 Script SQL de creación</w:t>
       </w:r>
-      <w:bookmarkEnd w:id="28"/>
+      <w:bookmarkEnd w:id="27"/>
     </w:p>
     <w:p>
       <w:pPr>
@@ -8175,7 +8010,7 @@
         <w:tblLook w:val="0000" w:firstRow="0" w:lastRow="0" w:firstColumn="0" w:lastColumn="0" w:noHBand="0" w:noVBand="0"/>
       </w:tblPr>
       <w:tblGrid>
-        <w:gridCol w:w="9000"/>
+        <w:gridCol w:w="10038"/>
       </w:tblGrid>
       <w:tr>
         <w:tc>
@@ -8190,101 +8025,2953 @@
             </w:tcMar>
           </w:tcPr>
           <w:p>
-            <w:r>
-              <w:rPr>
-                <w:rFonts w:ascii="Consolas" w:eastAsia="Consolas" w:hAnsi="Consolas" w:cs="Consolas"/>
-                <w:sz w:val="20"/>
-                <w:szCs w:val="20"/>
-              </w:rPr>
-              <w:t xml:space="preserve">-- CREATE DATABASE </w:t>
+            <w:pPr>
+              <w:rPr>
+                <w:lang w:val="en-US"/>
+              </w:rPr>
+            </w:pPr>
+            <w:r>
+              <w:rPr>
+                <w:lang w:val="en-US"/>
+              </w:rPr>
+              <w:t>-- MySQL Workbench Forward Engineering</w:t>
+            </w:r>
+          </w:p>
+          <w:p>
+            <w:pPr>
+              <w:rPr>
+                <w:lang w:val="en-US"/>
+              </w:rPr>
+            </w:pPr>
+          </w:p>
+          <w:p>
+            <w:pPr>
+              <w:rPr>
+                <w:lang w:val="en-US"/>
+              </w:rPr>
+            </w:pPr>
+            <w:r>
+              <w:rPr>
+                <w:lang w:val="en-US"/>
+              </w:rPr>
+              <w:t>SET @OLD_UNIQUE_CHECKS=@@UNIQUE_CHECKS, UNIQUE_CHECKS=0;</w:t>
+            </w:r>
+          </w:p>
+          <w:p>
+            <w:pPr>
+              <w:rPr>
+                <w:lang w:val="en-US"/>
+              </w:rPr>
+            </w:pPr>
+            <w:r>
+              <w:rPr>
+                <w:lang w:val="en-US"/>
+              </w:rPr>
+              <w:t>SET @OLD_FOREIGN_KEY_CHECKS=@@FOREIGN_KEY_CHECKS, FOREIGN_KEY_CHECKS=0;</w:t>
+            </w:r>
+          </w:p>
+          <w:p>
+            <w:pPr>
+              <w:rPr>
+                <w:lang w:val="en-US"/>
+              </w:rPr>
+            </w:pPr>
+            <w:r>
+              <w:rPr>
+                <w:lang w:val="en-US"/>
+              </w:rPr>
+              <w:t>SET @OLD_SQL_MODE=@@SQL_MODE, SQL_MODE='ONLY_FULL_GROUP_BY,STRICT_TRANS_TABLES,NO_ZERO_IN_DATE,NO_ZERO_DATE,ERROR_FOR_DIVISION_BY_ZERO,NO_ENGINE_SUBSTITUTION';</w:t>
+            </w:r>
+          </w:p>
+          <w:p>
+            <w:pPr>
+              <w:rPr>
+                <w:lang w:val="en-US"/>
+              </w:rPr>
+            </w:pPr>
+          </w:p>
+          <w:p>
+            <w:r>
+              <w:t>-- -----------------------------------------------------</w:t>
+            </w:r>
+          </w:p>
+          <w:p>
+            <w:r>
+              <w:t xml:space="preserve">-- </w:t>
             </w:r>
             <w:proofErr w:type="spellStart"/>
             <w:r>
-              <w:rPr>
-                <w:rFonts w:ascii="Consolas" w:eastAsia="Consolas" w:hAnsi="Consolas" w:cs="Consolas"/>
-                <w:sz w:val="20"/>
-                <w:szCs w:val="20"/>
-              </w:rPr>
-              <w:t>nombre_bd</w:t>
+              <w:t>Schema</w:t>
             </w:r>
             <w:proofErr w:type="spellEnd"/>
             <w:r>
-              <w:rPr>
-                <w:rFonts w:ascii="Consolas" w:eastAsia="Consolas" w:hAnsi="Consolas" w:cs="Consolas"/>
-                <w:sz w:val="20"/>
-                <w:szCs w:val="20"/>
-              </w:rPr>
+              <w:t xml:space="preserve"> </w:t>
+            </w:r>
+            <w:proofErr w:type="spellStart"/>
+            <w:r>
+              <w:t>salas_de_ensayo_db</w:t>
+            </w:r>
+            <w:proofErr w:type="spellEnd"/>
+          </w:p>
+          <w:p>
+            <w:r>
+              <w:t>-- -----------------------------------------------------</w:t>
+            </w:r>
+          </w:p>
+          <w:p/>
+          <w:p>
+            <w:r>
+              <w:t>-- -----------------------------------------------------</w:t>
+            </w:r>
+          </w:p>
+          <w:p>
+            <w:r>
+              <w:t xml:space="preserve">-- </w:t>
+            </w:r>
+            <w:proofErr w:type="spellStart"/>
+            <w:r>
+              <w:t>Schema</w:t>
+            </w:r>
+            <w:proofErr w:type="spellEnd"/>
+            <w:r>
+              <w:t xml:space="preserve"> </w:t>
+            </w:r>
+            <w:proofErr w:type="spellStart"/>
+            <w:r>
+              <w:t>salas_de_ensayo_db</w:t>
+            </w:r>
+            <w:proofErr w:type="spellEnd"/>
+          </w:p>
+          <w:p>
+            <w:r>
+              <w:t>-- -----------------------------------------------------</w:t>
+            </w:r>
+          </w:p>
+          <w:p>
+            <w:pPr>
+              <w:rPr>
+                <w:lang w:val="en-US"/>
+              </w:rPr>
+            </w:pPr>
+            <w:r>
+              <w:rPr>
+                <w:lang w:val="en-US"/>
+              </w:rPr>
+              <w:t>CREATE SCHEMA IF NOT EXISTS `salas_de_ensayo_db` DEFAULT CHARACTER SET utf8 ;</w:t>
+            </w:r>
+          </w:p>
+          <w:p>
+            <w:r>
+              <w:t>USE `</w:t>
+            </w:r>
+            <w:proofErr w:type="spellStart"/>
+            <w:r>
+              <w:t>salas_de_ensayo_db</w:t>
+            </w:r>
+            <w:proofErr w:type="spellEnd"/>
+            <w:r>
+              <w:t>` ;</w:t>
+            </w:r>
+          </w:p>
+          <w:p/>
+          <w:p/>
+          <w:p>
+            <w:r>
+              <w:t>-- -----------------------------------------------------</w:t>
+            </w:r>
+          </w:p>
+          <w:p>
+            <w:r>
+              <w:t xml:space="preserve">-- </w:t>
+            </w:r>
+            <w:proofErr w:type="spellStart"/>
+            <w:r>
+              <w:t>Table</w:t>
+            </w:r>
+            <w:proofErr w:type="spellEnd"/>
+            <w:r>
+              <w:t xml:space="preserve"> `salas_de_ensayo_</w:t>
+            </w:r>
+            <w:proofErr w:type="spellStart"/>
+            <w:r>
+              <w:t>db</w:t>
+            </w:r>
+            <w:proofErr w:type="spellEnd"/>
+            <w:r>
+              <w:t>`.`persona`</w:t>
+            </w:r>
+          </w:p>
+          <w:p>
+            <w:pPr>
+              <w:rPr>
+                <w:lang w:val="en-US"/>
+              </w:rPr>
+            </w:pPr>
+            <w:r>
+              <w:rPr>
+                <w:lang w:val="en-US"/>
+              </w:rPr>
+              <w:t>-- -----------------------------------------------------</w:t>
+            </w:r>
+          </w:p>
+          <w:p>
+            <w:pPr>
+              <w:rPr>
+                <w:lang w:val="en-US"/>
+              </w:rPr>
+            </w:pPr>
+            <w:r>
+              <w:rPr>
+                <w:lang w:val="en-US"/>
+              </w:rPr>
+              <w:t>CREATE TABLE IF NOT EXISTS `salas_de_ensayo_db`.`persona`(</w:t>
+            </w:r>
+          </w:p>
+          <w:p>
+            <w:pPr>
+              <w:rPr>
+                <w:lang w:val="en-US"/>
+              </w:rPr>
+            </w:pPr>
+            <w:r>
+              <w:rPr>
+                <w:lang w:val="en-US"/>
+              </w:rPr>
+              <w:t xml:space="preserve">  `dni` VARCHAR(10) NOT NULL,</w:t>
+            </w:r>
+          </w:p>
+          <w:p>
+            <w:pPr>
+              <w:rPr>
+                <w:lang w:val="en-US"/>
+              </w:rPr>
+            </w:pPr>
+            <w:r>
+              <w:rPr>
+                <w:lang w:val="en-US"/>
+              </w:rPr>
+              <w:t xml:space="preserve">  `correo` VARCHAR(45) NOT NULL,</w:t>
+            </w:r>
+          </w:p>
+          <w:p>
+            <w:pPr>
+              <w:rPr>
+                <w:lang w:val="en-US"/>
+              </w:rPr>
+            </w:pPr>
+            <w:r>
+              <w:rPr>
+                <w:lang w:val="en-US"/>
+              </w:rPr>
+              <w:t xml:space="preserve">  `nombre` VARCHAR(45) NOT NULL,</w:t>
+            </w:r>
+          </w:p>
+          <w:p>
+            <w:pPr>
+              <w:rPr>
+                <w:lang w:val="en-US"/>
+              </w:rPr>
+            </w:pPr>
+            <w:r>
+              <w:rPr>
+                <w:lang w:val="en-US"/>
+              </w:rPr>
+              <w:t xml:space="preserve">  `telefono` VARCHAR(45) NOT NULL,</w:t>
+            </w:r>
+          </w:p>
+          <w:p>
+            <w:pPr>
+              <w:rPr>
+                <w:lang w:val="en-US"/>
+              </w:rPr>
+            </w:pPr>
+            <w:r>
+              <w:rPr>
+                <w:lang w:val="en-US"/>
+              </w:rPr>
+              <w:t xml:space="preserve">  PRIMARY KEY (`dni`),</w:t>
+            </w:r>
+          </w:p>
+          <w:p>
+            <w:pPr>
+              <w:rPr>
+                <w:lang w:val="en-US"/>
+              </w:rPr>
+            </w:pPr>
+            <w:r>
+              <w:rPr>
+                <w:lang w:val="en-US"/>
+              </w:rPr>
+              <w:t xml:space="preserve">  UNIQUE INDEX `correo_UNIQUE` (`correo` ASC)</w:t>
+            </w:r>
+          </w:p>
+          <w:p>
+            <w:pPr>
+              <w:rPr>
+                <w:lang w:val="en-US"/>
+              </w:rPr>
+            </w:pPr>
+            <w:r>
+              <w:rPr>
+                <w:lang w:val="en-US"/>
+              </w:rPr>
+              <w:t>) ENGINE = InnoDB;</w:t>
+            </w:r>
+          </w:p>
+          <w:p>
+            <w:pPr>
+              <w:rPr>
+                <w:lang w:val="en-US"/>
+              </w:rPr>
+            </w:pPr>
+          </w:p>
+          <w:p>
+            <w:pPr>
+              <w:rPr>
+                <w:lang w:val="en-US"/>
+              </w:rPr>
+            </w:pPr>
+          </w:p>
+          <w:p>
+            <w:pPr>
+              <w:rPr>
+                <w:lang w:val="en-US"/>
+              </w:rPr>
+            </w:pPr>
+            <w:r>
+              <w:rPr>
+                <w:lang w:val="en-US"/>
+              </w:rPr>
+              <w:t>-- -----------------------------------------------------</w:t>
+            </w:r>
+          </w:p>
+          <w:p>
+            <w:pPr>
+              <w:rPr>
+                <w:lang w:val="en-US"/>
+              </w:rPr>
+            </w:pPr>
+            <w:r>
+              <w:rPr>
+                <w:lang w:val="en-US"/>
+              </w:rPr>
+              <w:t>-- Table `salas_de_ensayo_db`.`sala`</w:t>
+            </w:r>
+          </w:p>
+          <w:p>
+            <w:pPr>
+              <w:rPr>
+                <w:lang w:val="en-US"/>
+              </w:rPr>
+            </w:pPr>
+            <w:r>
+              <w:rPr>
+                <w:lang w:val="en-US"/>
+              </w:rPr>
+              <w:t>-- -----------------------------------------------------</w:t>
+            </w:r>
+          </w:p>
+          <w:p>
+            <w:pPr>
+              <w:rPr>
+                <w:lang w:val="en-US"/>
+              </w:rPr>
+            </w:pPr>
+            <w:r>
+              <w:rPr>
+                <w:lang w:val="en-US"/>
+              </w:rPr>
+              <w:t>CREATE TABLE IF NOT EXISTS `salas_de_ensayo_db`.`sala`(</w:t>
+            </w:r>
+          </w:p>
+          <w:p>
+            <w:pPr>
+              <w:rPr>
+                <w:lang w:val="en-US"/>
+              </w:rPr>
+            </w:pPr>
+            <w:r>
+              <w:rPr>
+                <w:lang w:val="en-US"/>
+              </w:rPr>
+              <w:lastRenderedPageBreak/>
+              <w:t xml:space="preserve">  `nro` BIGINT NOT NULL AUTO_INCREMENT,</w:t>
+            </w:r>
+          </w:p>
+          <w:p>
+            <w:pPr>
+              <w:rPr>
+                <w:lang w:val="en-US"/>
+              </w:rPr>
+            </w:pPr>
+            <w:r>
+              <w:rPr>
+                <w:lang w:val="en-US"/>
+              </w:rPr>
+              <w:t xml:space="preserve">  `nombre` VARCHAR(45) NOT NULL,</w:t>
+            </w:r>
+          </w:p>
+          <w:p>
+            <w:pPr>
+              <w:rPr>
+                <w:lang w:val="en-US"/>
+              </w:rPr>
+            </w:pPr>
+            <w:r>
+              <w:rPr>
+                <w:lang w:val="en-US"/>
+              </w:rPr>
+              <w:t xml:space="preserve">  `capacidad` INT NOT NULL,</w:t>
+            </w:r>
+          </w:p>
+          <w:p>
+            <w:pPr>
+              <w:rPr>
+                <w:lang w:val="en-US"/>
+              </w:rPr>
+            </w:pPr>
+            <w:r>
+              <w:rPr>
+                <w:lang w:val="en-US"/>
+              </w:rPr>
+              <w:t xml:space="preserve">  `habilitada` TINYINT NOT NULL DEFAULT 1,</w:t>
+            </w:r>
+          </w:p>
+          <w:p>
+            <w:r>
+              <w:rPr>
+                <w:lang w:val="en-US"/>
+              </w:rPr>
+              <w:t xml:space="preserve">  </w:t>
+            </w:r>
+            <w:r>
+              <w:t>`</w:t>
+            </w:r>
+            <w:proofErr w:type="spellStart"/>
+            <w:r>
+              <w:t>precio_x_hora</w:t>
+            </w:r>
+            <w:proofErr w:type="spellEnd"/>
+            <w:r>
+              <w:t>` DECIMAL(10,2) NOT NULL,</w:t>
+            </w:r>
+          </w:p>
+          <w:p/>
+          <w:p>
+            <w:r>
+              <w:t xml:space="preserve">  PRIMARY KEY (`</w:t>
+            </w:r>
+            <w:proofErr w:type="spellStart"/>
+            <w:r>
+              <w:t>nro</w:t>
+            </w:r>
+            <w:proofErr w:type="spellEnd"/>
+            <w:r>
+              <w:t>`),</w:t>
+            </w:r>
+          </w:p>
+          <w:p>
+            <w:r>
+              <w:t xml:space="preserve">  UNIQUE INDEX `</w:t>
+            </w:r>
+            <w:proofErr w:type="spellStart"/>
+            <w:r>
+              <w:t>nombre_UNIQUE</w:t>
+            </w:r>
+            <w:proofErr w:type="spellEnd"/>
+            <w:r>
+              <w:t>` (`nombre` ASC),</w:t>
+            </w:r>
+          </w:p>
+          <w:p/>
+          <w:p>
+            <w:r>
+              <w:t xml:space="preserve">  CONSTRAINT `</w:t>
+            </w:r>
+            <w:proofErr w:type="spellStart"/>
+            <w:r>
+              <w:t>chk_sala_capacidad</w:t>
+            </w:r>
+            <w:proofErr w:type="spellEnd"/>
+            <w:r>
+              <w:t>` CHECK (`capacidad` &gt; 0),</w:t>
+            </w:r>
+          </w:p>
+          <w:p>
+            <w:r>
+              <w:t xml:space="preserve">  CONSTRAINT `</w:t>
+            </w:r>
+            <w:proofErr w:type="spellStart"/>
+            <w:r>
+              <w:t>chk_sala_precio</w:t>
+            </w:r>
+            <w:proofErr w:type="spellEnd"/>
+            <w:r>
+              <w:t>` CHECK (`</w:t>
+            </w:r>
+            <w:proofErr w:type="spellStart"/>
+            <w:r>
+              <w:t>precio_x_hora</w:t>
+            </w:r>
+            <w:proofErr w:type="spellEnd"/>
+            <w:r>
+              <w:t>` &gt;= 0),</w:t>
+            </w:r>
+          </w:p>
+          <w:p>
+            <w:r>
+              <w:t xml:space="preserve">  CONSTRAINT `</w:t>
+            </w:r>
+            <w:proofErr w:type="spellStart"/>
+            <w:r>
+              <w:t>chk_sala_habilitada</w:t>
+            </w:r>
+            <w:proofErr w:type="spellEnd"/>
+            <w:r>
+              <w:t>` CHECK (`habilitada` IN (0, 1))</w:t>
+            </w:r>
+          </w:p>
+          <w:p>
+            <w:pPr>
+              <w:rPr>
+                <w:lang w:val="en-US"/>
+              </w:rPr>
+            </w:pPr>
+            <w:r>
+              <w:rPr>
+                <w:lang w:val="en-US"/>
+              </w:rPr>
+              <w:t>) ENGINE = InnoDB;</w:t>
+            </w:r>
+          </w:p>
+          <w:p>
+            <w:pPr>
+              <w:rPr>
+                <w:lang w:val="en-US"/>
+              </w:rPr>
+            </w:pPr>
+          </w:p>
+          <w:p>
+            <w:pPr>
+              <w:rPr>
+                <w:lang w:val="en-US"/>
+              </w:rPr>
+            </w:pPr>
+          </w:p>
+          <w:p>
+            <w:pPr>
+              <w:rPr>
+                <w:lang w:val="en-US"/>
+              </w:rPr>
+            </w:pPr>
+            <w:r>
+              <w:rPr>
+                <w:lang w:val="en-US"/>
+              </w:rPr>
+              <w:t>-- -----------------------------------------------------</w:t>
+            </w:r>
+          </w:p>
+          <w:p>
+            <w:pPr>
+              <w:rPr>
+                <w:lang w:val="en-US"/>
+              </w:rPr>
+            </w:pPr>
+            <w:r>
+              <w:rPr>
+                <w:lang w:val="en-US"/>
+              </w:rPr>
+              <w:t>-- Table `salas_de_ensayo_db`.`reserva`</w:t>
+            </w:r>
+          </w:p>
+          <w:p>
+            <w:pPr>
+              <w:rPr>
+                <w:lang w:val="en-US"/>
+              </w:rPr>
+            </w:pPr>
+            <w:r>
+              <w:rPr>
+                <w:lang w:val="en-US"/>
+              </w:rPr>
+              <w:t>-- -----------------------------------------------------</w:t>
+            </w:r>
+          </w:p>
+          <w:p>
+            <w:pPr>
+              <w:rPr>
+                <w:lang w:val="en-US"/>
+              </w:rPr>
+            </w:pPr>
+            <w:r>
+              <w:rPr>
+                <w:lang w:val="en-US"/>
+              </w:rPr>
+              <w:t>CREATE TABLE IF NOT EXISTS `salas_de_ensayo_db`.`reserva`(</w:t>
+            </w:r>
+          </w:p>
+          <w:p>
+            <w:pPr>
+              <w:rPr>
+                <w:lang w:val="en-US"/>
+              </w:rPr>
+            </w:pPr>
+            <w:r>
+              <w:rPr>
+                <w:lang w:val="en-US"/>
+              </w:rPr>
+              <w:t xml:space="preserve">  `nro` BIGINT NOT NULL AUTO_INCREMENT,</w:t>
+            </w:r>
+          </w:p>
+          <w:p>
+            <w:pPr>
+              <w:rPr>
+                <w:lang w:val="en-US"/>
+              </w:rPr>
+            </w:pPr>
+            <w:r>
+              <w:rPr>
+                <w:lang w:val="en-US"/>
+              </w:rPr>
+              <w:t xml:space="preserve">  `fecha` DATE NOT NULL,</w:t>
+            </w:r>
+          </w:p>
+          <w:p>
+            <w:pPr>
+              <w:rPr>
+                <w:lang w:val="en-US"/>
+              </w:rPr>
+            </w:pPr>
+            <w:r>
+              <w:rPr>
+                <w:lang w:val="en-US"/>
+              </w:rPr>
+              <w:t xml:space="preserve">  `hora_inicio` TIME NOT NULL,</w:t>
+            </w:r>
+          </w:p>
+          <w:p>
+            <w:pPr>
+              <w:rPr>
+                <w:lang w:val="en-US"/>
+              </w:rPr>
+            </w:pPr>
+            <w:r>
+              <w:rPr>
+                <w:lang w:val="en-US"/>
+              </w:rPr>
+              <w:t xml:space="preserve">  `hora_fin` TIME NOT NULL,</w:t>
+            </w:r>
+          </w:p>
+          <w:p>
+            <w:pPr>
+              <w:rPr>
+                <w:lang w:val="en-US"/>
+              </w:rPr>
+            </w:pPr>
+            <w:r>
+              <w:rPr>
+                <w:lang w:val="en-US"/>
+              </w:rPr>
+              <w:t xml:space="preserve">  `confirmada` TINYINT NOT NULL DEFAULT 1,</w:t>
+            </w:r>
+          </w:p>
+          <w:p>
+            <w:r>
+              <w:rPr>
+                <w:lang w:val="en-US"/>
+              </w:rPr>
+              <w:t xml:space="preserve">  </w:t>
+            </w:r>
+            <w:r>
+              <w:t>`</w:t>
+            </w:r>
+            <w:proofErr w:type="spellStart"/>
+            <w:r>
+              <w:t>sala_precio_x_hora</w:t>
+            </w:r>
+            <w:proofErr w:type="spellEnd"/>
+            <w:r>
+              <w:t>` DECIMAL(10,2) NOT NULL,</w:t>
+            </w:r>
+          </w:p>
+          <w:p>
+            <w:pPr>
+              <w:rPr>
+                <w:lang w:val="en-US"/>
+              </w:rPr>
+            </w:pPr>
+            <w:r>
+              <w:t xml:space="preserve">  </w:t>
+            </w:r>
+            <w:r>
+              <w:rPr>
+                <w:lang w:val="en-US"/>
+              </w:rPr>
+              <w:t>`dni_persona` VARCHAR(10) NOT NULL,</w:t>
+            </w:r>
+          </w:p>
+          <w:p>
+            <w:pPr>
+              <w:rPr>
+                <w:lang w:val="en-US"/>
+              </w:rPr>
+            </w:pPr>
+            <w:r>
+              <w:rPr>
+                <w:lang w:val="en-US"/>
+              </w:rPr>
+              <w:t xml:space="preserve">  `nro_sala` BIGINT NOT NULL,</w:t>
+            </w:r>
+          </w:p>
+          <w:p>
+            <w:pPr>
+              <w:rPr>
+                <w:lang w:val="en-US"/>
+              </w:rPr>
+            </w:pPr>
+          </w:p>
+          <w:p>
+            <w:r>
+              <w:rPr>
+                <w:lang w:val="en-US"/>
+              </w:rPr>
+              <w:t xml:space="preserve">  </w:t>
+            </w:r>
+            <w:r>
+              <w:t>PRIMARY KEY (`</w:t>
+            </w:r>
+            <w:proofErr w:type="spellStart"/>
+            <w:r>
+              <w:t>nro</w:t>
+            </w:r>
+            <w:proofErr w:type="spellEnd"/>
+            <w:r>
+              <w:t>`),</w:t>
+            </w:r>
+          </w:p>
+          <w:p>
+            <w:r>
+              <w:t xml:space="preserve">  INDEX `fk_reserva_persona1_idx` (`</w:t>
+            </w:r>
+            <w:proofErr w:type="spellStart"/>
+            <w:r>
+              <w:t>dni_persona</w:t>
+            </w:r>
+            <w:proofErr w:type="spellEnd"/>
+            <w:r>
+              <w:t>` ASC),</w:t>
+            </w:r>
+          </w:p>
+          <w:p>
+            <w:r>
+              <w:t xml:space="preserve">  INDEX `fk_reserva_sala1_idx` (`</w:t>
+            </w:r>
+            <w:proofErr w:type="spellStart"/>
+            <w:r>
+              <w:t>nro_sala</w:t>
+            </w:r>
+            <w:proofErr w:type="spellEnd"/>
+            <w:r>
+              <w:t>` ASC),</w:t>
+            </w:r>
+          </w:p>
+          <w:p/>
+          <w:p>
+            <w:r>
+              <w:t xml:space="preserve">  CONSTRAINT `</w:t>
+            </w:r>
+            <w:proofErr w:type="spellStart"/>
+            <w:r>
+              <w:t>chk_reserva_horarios</w:t>
+            </w:r>
+            <w:proofErr w:type="spellEnd"/>
+            <w:r>
+              <w:t>` CHECK (`</w:t>
+            </w:r>
+            <w:proofErr w:type="spellStart"/>
+            <w:r>
+              <w:t>hora_fin</w:t>
+            </w:r>
+            <w:proofErr w:type="spellEnd"/>
+            <w:r>
+              <w:t>` &gt; `</w:t>
+            </w:r>
+            <w:proofErr w:type="spellStart"/>
+            <w:r>
+              <w:t>hora_inicio</w:t>
+            </w:r>
+            <w:proofErr w:type="spellEnd"/>
+            <w:r>
+              <w:t>`),</w:t>
+            </w:r>
+          </w:p>
+          <w:p>
+            <w:pPr>
+              <w:rPr>
+                <w:lang w:val="en-US"/>
+              </w:rPr>
+            </w:pPr>
+            <w:r>
+              <w:t xml:space="preserve">  </w:t>
+            </w:r>
+            <w:r>
+              <w:rPr>
+                <w:lang w:val="en-US"/>
+              </w:rPr>
+              <w:t>CONSTRAINT `chk_reserva_confirmacion` CHECK (`confirmada` IN (0, 1)),</w:t>
+            </w:r>
+          </w:p>
+          <w:p>
+            <w:pPr>
+              <w:rPr>
+                <w:lang w:val="en-US"/>
+              </w:rPr>
+            </w:pPr>
+          </w:p>
+          <w:p>
+            <w:pPr>
+              <w:rPr>
+                <w:lang w:val="en-US"/>
+              </w:rPr>
+            </w:pPr>
+            <w:r>
+              <w:rPr>
+                <w:lang w:val="en-US"/>
+              </w:rPr>
+              <w:t xml:space="preserve">  CONSTRAINT `fk_dni_persona` FOREIGN KEY (`dni_persona`)</w:t>
+            </w:r>
+          </w:p>
+          <w:p>
+            <w:r>
+              <w:rPr>
+                <w:lang w:val="en-US"/>
+              </w:rPr>
+              <w:t xml:space="preserve">    </w:t>
+            </w:r>
+            <w:r>
+              <w:t>REFERENCES `salas_de_ensayo_</w:t>
+            </w:r>
+            <w:proofErr w:type="spellStart"/>
+            <w:r>
+              <w:t>db</w:t>
+            </w:r>
+            <w:proofErr w:type="spellEnd"/>
+            <w:r>
+              <w:t>`.`persona` (`</w:t>
+            </w:r>
+            <w:proofErr w:type="spellStart"/>
+            <w:r>
+              <w:t>dni</w:t>
+            </w:r>
+            <w:proofErr w:type="spellEnd"/>
+            <w:r>
+              <w:t>`)</w:t>
+            </w:r>
+          </w:p>
+          <w:p>
+            <w:pPr>
+              <w:rPr>
+                <w:lang w:val="en-US"/>
+              </w:rPr>
+            </w:pPr>
+            <w:r>
+              <w:t xml:space="preserve">    </w:t>
+            </w:r>
+            <w:r>
+              <w:rPr>
+                <w:lang w:val="en-US"/>
+              </w:rPr>
+              <w:t>ON DELETE NO ACTION ON UPDATE CASCADE,</w:t>
+            </w:r>
+          </w:p>
+          <w:p>
+            <w:pPr>
+              <w:rPr>
+                <w:lang w:val="en-US"/>
+              </w:rPr>
+            </w:pPr>
+          </w:p>
+          <w:p>
+            <w:pPr>
+              <w:rPr>
+                <w:lang w:val="en-US"/>
+              </w:rPr>
+            </w:pPr>
+            <w:r>
+              <w:rPr>
+                <w:lang w:val="en-US"/>
+              </w:rPr>
+              <w:t xml:space="preserve">  CONSTRAINT `fk_nro_sala` FOREIGN KEY (`nro_sala`)</w:t>
+            </w:r>
+          </w:p>
+          <w:p>
+            <w:r>
+              <w:rPr>
+                <w:lang w:val="en-US"/>
+              </w:rPr>
+              <w:t xml:space="preserve">    </w:t>
+            </w:r>
+            <w:r>
+              <w:t>REFERENCES `salas_de_ensayo_</w:t>
+            </w:r>
+            <w:proofErr w:type="spellStart"/>
+            <w:r>
+              <w:t>db</w:t>
+            </w:r>
+            <w:proofErr w:type="spellEnd"/>
+            <w:r>
+              <w:t>`.`sala` (`</w:t>
+            </w:r>
+            <w:proofErr w:type="spellStart"/>
+            <w:r>
+              <w:t>nro</w:t>
+            </w:r>
+            <w:proofErr w:type="spellEnd"/>
+            <w:r>
+              <w:t>`)</w:t>
+            </w:r>
+          </w:p>
+          <w:p>
+            <w:pPr>
+              <w:rPr>
+                <w:lang w:val="en-US"/>
+              </w:rPr>
+            </w:pPr>
+            <w:r>
+              <w:t xml:space="preserve">    </w:t>
+            </w:r>
+            <w:r>
+              <w:rPr>
+                <w:lang w:val="en-US"/>
+              </w:rPr>
+              <w:t>ON DELETE NO ACTION ON UPDATE CASCADE</w:t>
+            </w:r>
+          </w:p>
+          <w:p>
+            <w:pPr>
+              <w:rPr>
+                <w:lang w:val="en-US"/>
+              </w:rPr>
+            </w:pPr>
+            <w:r>
+              <w:rPr>
+                <w:lang w:val="en-US"/>
+              </w:rPr>
+              <w:t>) ENGINE = InnoDB;</w:t>
+            </w:r>
+          </w:p>
+          <w:p>
+            <w:pPr>
+              <w:rPr>
+                <w:lang w:val="en-US"/>
+              </w:rPr>
+            </w:pPr>
+          </w:p>
+          <w:p>
+            <w:pPr>
+              <w:rPr>
+                <w:lang w:val="en-US"/>
+              </w:rPr>
+            </w:pPr>
+          </w:p>
+          <w:p>
+            <w:pPr>
+              <w:rPr>
+                <w:lang w:val="en-US"/>
+              </w:rPr>
+            </w:pPr>
+            <w:r>
+              <w:rPr>
+                <w:lang w:val="en-US"/>
+              </w:rPr>
+              <w:t>-- -----------------------------------------------------</w:t>
+            </w:r>
+          </w:p>
+          <w:p>
+            <w:pPr>
+              <w:rPr>
+                <w:lang w:val="en-US"/>
+              </w:rPr>
+            </w:pPr>
+            <w:r>
+              <w:rPr>
+                <w:lang w:val="en-US"/>
+              </w:rPr>
+              <w:t>-- Table `salas_de_ensayo_db`.`categoria`</w:t>
+            </w:r>
+          </w:p>
+          <w:p>
+            <w:pPr>
+              <w:rPr>
+                <w:lang w:val="en-US"/>
+              </w:rPr>
+            </w:pPr>
+            <w:r>
+              <w:rPr>
+                <w:lang w:val="en-US"/>
+              </w:rPr>
+              <w:t>-- -----------------------------------------------------</w:t>
+            </w:r>
+          </w:p>
+          <w:p>
+            <w:pPr>
+              <w:rPr>
+                <w:lang w:val="en-US"/>
+              </w:rPr>
+            </w:pPr>
+            <w:r>
+              <w:rPr>
+                <w:lang w:val="en-US"/>
+              </w:rPr>
+              <w:t>CREATE TABLE IF NOT EXISTS `salas_de_ensayo_db`.`categoria`(</w:t>
+            </w:r>
+          </w:p>
+          <w:p>
+            <w:pPr>
+              <w:rPr>
+                <w:lang w:val="en-US"/>
+              </w:rPr>
+            </w:pPr>
+            <w:r>
+              <w:rPr>
+                <w:lang w:val="en-US"/>
+              </w:rPr>
+              <w:t xml:space="preserve">  `id` BIGINT NOT NULL AUTO_INCREMENT,</w:t>
+            </w:r>
+          </w:p>
+          <w:p>
+            <w:pPr>
+              <w:rPr>
+                <w:lang w:val="en-US"/>
+              </w:rPr>
+            </w:pPr>
+            <w:r>
+              <w:rPr>
+                <w:lang w:val="en-US"/>
+              </w:rPr>
+              <w:t xml:space="preserve">  `descripcion` VARCHAR(100) NOT NULL,</w:t>
+            </w:r>
+          </w:p>
+          <w:p>
+            <w:pPr>
+              <w:rPr>
+                <w:lang w:val="en-US"/>
+              </w:rPr>
+            </w:pPr>
+            <w:r>
+              <w:rPr>
+                <w:lang w:val="en-US"/>
+              </w:rPr>
+              <w:t xml:space="preserve">  `id_categoria_padre` BIGINT NULL,</w:t>
+            </w:r>
+          </w:p>
+          <w:p>
+            <w:pPr>
+              <w:rPr>
+                <w:lang w:val="en-US"/>
+              </w:rPr>
+            </w:pPr>
+          </w:p>
+          <w:p>
+            <w:pPr>
+              <w:rPr>
+                <w:lang w:val="en-US"/>
+              </w:rPr>
+            </w:pPr>
+            <w:r>
+              <w:rPr>
+                <w:lang w:val="en-US"/>
+              </w:rPr>
+              <w:t xml:space="preserve">  PRIMARY KEY (`id`),</w:t>
+            </w:r>
+          </w:p>
+          <w:p>
+            <w:r>
+              <w:rPr>
+                <w:lang w:val="en-US"/>
+              </w:rPr>
+              <w:t xml:space="preserve">  </w:t>
+            </w:r>
+            <w:r>
+              <w:t>INDEX `fk_categoria_categoria1_idx` (`</w:t>
+            </w:r>
+            <w:proofErr w:type="spellStart"/>
+            <w:r>
+              <w:t>id_categoria_padre</w:t>
+            </w:r>
+            <w:proofErr w:type="spellEnd"/>
+            <w:r>
+              <w:t>` ASC),</w:t>
+            </w:r>
+          </w:p>
+          <w:p/>
+          <w:p>
+            <w:pPr>
+              <w:rPr>
+                <w:lang w:val="en-US"/>
+              </w:rPr>
+            </w:pPr>
+            <w:r>
+              <w:t xml:space="preserve">  </w:t>
+            </w:r>
+            <w:r>
+              <w:rPr>
+                <w:lang w:val="en-US"/>
+              </w:rPr>
+              <w:t>CONSTRAINT `fk_categoria_categoria1` FOREIGN KEY (`id_categoria_padre`)</w:t>
+            </w:r>
+          </w:p>
+          <w:p>
+            <w:r>
+              <w:rPr>
+                <w:lang w:val="en-US"/>
+              </w:rPr>
+              <w:t xml:space="preserve">    </w:t>
+            </w:r>
+            <w:r>
+              <w:t>REFERENCES `salas_de_ensayo_</w:t>
+            </w:r>
+            <w:proofErr w:type="spellStart"/>
+            <w:r>
+              <w:t>db</w:t>
+            </w:r>
+            <w:proofErr w:type="spellEnd"/>
+            <w:r>
+              <w:t>`.`</w:t>
+            </w:r>
+            <w:proofErr w:type="spellStart"/>
+            <w:r>
+              <w:t>categoria</w:t>
+            </w:r>
+            <w:proofErr w:type="spellEnd"/>
+            <w:r>
+              <w:t>` (`id`)</w:t>
+            </w:r>
+          </w:p>
+          <w:p>
+            <w:pPr>
+              <w:rPr>
+                <w:lang w:val="en-US"/>
+              </w:rPr>
+            </w:pPr>
+            <w:r>
+              <w:t xml:space="preserve">    </w:t>
+            </w:r>
+            <w:r>
+              <w:rPr>
+                <w:lang w:val="en-US"/>
+              </w:rPr>
+              <w:t>ON DELETE NO ACTION ON UPDATE CASCADE</w:t>
+            </w:r>
+          </w:p>
+          <w:p>
+            <w:pPr>
+              <w:rPr>
+                <w:lang w:val="en-US"/>
+              </w:rPr>
+            </w:pPr>
+            <w:r>
+              <w:rPr>
+                <w:lang w:val="en-US"/>
+              </w:rPr>
+              <w:t>) ENGINE = InnoDB;</w:t>
+            </w:r>
+          </w:p>
+          <w:p>
+            <w:pPr>
+              <w:rPr>
+                <w:lang w:val="en-US"/>
+              </w:rPr>
+            </w:pPr>
+          </w:p>
+          <w:p>
+            <w:pPr>
+              <w:rPr>
+                <w:lang w:val="en-US"/>
+              </w:rPr>
+            </w:pPr>
+          </w:p>
+          <w:p>
+            <w:pPr>
+              <w:rPr>
+                <w:lang w:val="en-US"/>
+              </w:rPr>
+            </w:pPr>
+            <w:r>
+              <w:rPr>
+                <w:lang w:val="en-US"/>
+              </w:rPr>
+              <w:t>-- -----------------------------------------------------</w:t>
+            </w:r>
+          </w:p>
+          <w:p>
+            <w:pPr>
+              <w:rPr>
+                <w:lang w:val="en-US"/>
+              </w:rPr>
+            </w:pPr>
+            <w:r>
+              <w:rPr>
+                <w:lang w:val="en-US"/>
+              </w:rPr>
+              <w:t>-- Table `salas_de_ensayo_db`.`fabricante`</w:t>
+            </w:r>
+          </w:p>
+          <w:p>
+            <w:pPr>
+              <w:rPr>
+                <w:lang w:val="en-US"/>
+              </w:rPr>
+            </w:pPr>
+            <w:r>
+              <w:rPr>
+                <w:lang w:val="en-US"/>
+              </w:rPr>
+              <w:t>-- -----------------------------------------------------</w:t>
+            </w:r>
+          </w:p>
+          <w:p>
+            <w:pPr>
+              <w:rPr>
+                <w:lang w:val="en-US"/>
+              </w:rPr>
+            </w:pPr>
+            <w:r>
+              <w:rPr>
+                <w:lang w:val="en-US"/>
+              </w:rPr>
+              <w:t>CREATE TABLE IF NOT EXISTS `salas_de_ensayo_db`.`fabricante`(</w:t>
+            </w:r>
+          </w:p>
+          <w:p>
+            <w:pPr>
+              <w:rPr>
+                <w:lang w:val="en-US"/>
+              </w:rPr>
+            </w:pPr>
+            <w:r>
+              <w:rPr>
+                <w:lang w:val="en-US"/>
+              </w:rPr>
+              <w:t xml:space="preserve">  `id` BIGINT NOT NULL AUTO_INCREMENT,</w:t>
+            </w:r>
+          </w:p>
+          <w:p>
+            <w:pPr>
+              <w:rPr>
+                <w:lang w:val="en-US"/>
+              </w:rPr>
+            </w:pPr>
+            <w:r>
+              <w:rPr>
+                <w:lang w:val="en-US"/>
+              </w:rPr>
+              <w:t xml:space="preserve">  `nombre` VARCHAR(45) NOT NULL,</w:t>
+            </w:r>
+          </w:p>
+          <w:p>
+            <w:pPr>
+              <w:rPr>
+                <w:lang w:val="en-US"/>
+              </w:rPr>
+            </w:pPr>
+            <w:r>
+              <w:rPr>
+                <w:lang w:val="en-US"/>
+              </w:rPr>
+              <w:t xml:space="preserve">  PRIMARY KEY (`id`)</w:t>
+            </w:r>
+          </w:p>
+          <w:p>
+            <w:pPr>
+              <w:rPr>
+                <w:lang w:val="en-US"/>
+              </w:rPr>
+            </w:pPr>
+            <w:r>
+              <w:rPr>
+                <w:lang w:val="en-US"/>
+              </w:rPr>
+              <w:t>) ENGINE = InnoDB;</w:t>
+            </w:r>
+          </w:p>
+          <w:p>
+            <w:pPr>
+              <w:rPr>
+                <w:lang w:val="en-US"/>
+              </w:rPr>
+            </w:pPr>
+          </w:p>
+          <w:p>
+            <w:pPr>
+              <w:rPr>
+                <w:lang w:val="en-US"/>
+              </w:rPr>
+            </w:pPr>
+          </w:p>
+          <w:p>
+            <w:pPr>
+              <w:rPr>
+                <w:lang w:val="en-US"/>
+              </w:rPr>
+            </w:pPr>
+            <w:r>
+              <w:rPr>
+                <w:lang w:val="en-US"/>
+              </w:rPr>
+              <w:t>-- -----------------------------------------------------</w:t>
+            </w:r>
+          </w:p>
+          <w:p>
+            <w:pPr>
+              <w:rPr>
+                <w:lang w:val="en-US"/>
+              </w:rPr>
+            </w:pPr>
+            <w:r>
+              <w:rPr>
+                <w:lang w:val="en-US"/>
+              </w:rPr>
+              <w:t>-- Table `salas_de_ensayo_db`.`item_inventario`</w:t>
+            </w:r>
+          </w:p>
+          <w:p>
+            <w:pPr>
+              <w:rPr>
+                <w:lang w:val="en-US"/>
+              </w:rPr>
+            </w:pPr>
+            <w:r>
+              <w:rPr>
+                <w:lang w:val="en-US"/>
+              </w:rPr>
+              <w:t>-- -----------------------------------------------------</w:t>
+            </w:r>
+          </w:p>
+          <w:p>
+            <w:pPr>
+              <w:rPr>
+                <w:lang w:val="en-US"/>
+              </w:rPr>
+            </w:pPr>
+            <w:r>
+              <w:rPr>
+                <w:lang w:val="en-US"/>
+              </w:rPr>
+              <w:t>CREATE TABLE IF NOT EXISTS `salas_de_ensayo_db`.`item_inventario`(</w:t>
+            </w:r>
+          </w:p>
+          <w:p>
+            <w:pPr>
+              <w:rPr>
+                <w:lang w:val="en-US"/>
+              </w:rPr>
+            </w:pPr>
+            <w:r>
+              <w:rPr>
+                <w:lang w:val="en-US"/>
+              </w:rPr>
+              <w:t xml:space="preserve">  `id` VARCHAR(10) NOT NULL,</w:t>
+            </w:r>
+          </w:p>
+          <w:p>
+            <w:pPr>
+              <w:rPr>
+                <w:lang w:val="en-US"/>
+              </w:rPr>
+            </w:pPr>
+            <w:r>
+              <w:rPr>
+                <w:lang w:val="en-US"/>
+              </w:rPr>
+              <w:t xml:space="preserve">  `stock` INT NOT NULL,</w:t>
+            </w:r>
+          </w:p>
+          <w:p>
+            <w:r>
+              <w:rPr>
+                <w:lang w:val="en-US"/>
+              </w:rPr>
+              <w:t xml:space="preserve">  </w:t>
+            </w:r>
+            <w:r>
+              <w:t>`</w:t>
+            </w:r>
+            <w:proofErr w:type="spellStart"/>
+            <w:r>
+              <w:t>descripcion</w:t>
+            </w:r>
+            <w:proofErr w:type="spellEnd"/>
+            <w:r>
+              <w:t>` VARCHAR(100) NOT NULL,</w:t>
+            </w:r>
+          </w:p>
+          <w:p>
+            <w:r>
+              <w:t xml:space="preserve">  `</w:t>
+            </w:r>
+            <w:proofErr w:type="spellStart"/>
+            <w:r>
+              <w:t>costo_alquiler</w:t>
+            </w:r>
+            <w:proofErr w:type="spellEnd"/>
+            <w:r>
+              <w:t>` DECIMAL(10,2) NOT NULL,</w:t>
+            </w:r>
+          </w:p>
+          <w:p>
+            <w:pPr>
+              <w:rPr>
+                <w:lang w:val="en-US"/>
+              </w:rPr>
+            </w:pPr>
+            <w:r>
+              <w:t xml:space="preserve">  </w:t>
+            </w:r>
+            <w:r>
+              <w:rPr>
+                <w:lang w:val="en-US"/>
+              </w:rPr>
+              <w:t>`id_categoria` BIGINT NOT NULL,</w:t>
+            </w:r>
+          </w:p>
+          <w:p>
+            <w:pPr>
+              <w:rPr>
+                <w:lang w:val="en-US"/>
+              </w:rPr>
+            </w:pPr>
+            <w:r>
+              <w:rPr>
+                <w:lang w:val="en-US"/>
+              </w:rPr>
+              <w:t xml:space="preserve">  `id_fabricante` BIGINT NOT NULL,</w:t>
+            </w:r>
+          </w:p>
+          <w:p>
+            <w:pPr>
+              <w:rPr>
+                <w:lang w:val="en-US"/>
+              </w:rPr>
+            </w:pPr>
+          </w:p>
+          <w:p>
+            <w:pPr>
+              <w:rPr>
+                <w:lang w:val="en-US"/>
+              </w:rPr>
+            </w:pPr>
+            <w:r>
+              <w:rPr>
+                <w:lang w:val="en-US"/>
+              </w:rPr>
+              <w:t xml:space="preserve">  PRIMARY KEY (`id`),</w:t>
+            </w:r>
+          </w:p>
+          <w:p>
+            <w:pPr>
+              <w:rPr>
+                <w:lang w:val="en-US"/>
+              </w:rPr>
+            </w:pPr>
+            <w:r>
+              <w:rPr>
+                <w:lang w:val="en-US"/>
+              </w:rPr>
+              <w:t xml:space="preserve">  INDEX `fk_item_inventario_categoria1_idx` (`id_categoria` ASC),</w:t>
+            </w:r>
+          </w:p>
+          <w:p>
+            <w:pPr>
+              <w:rPr>
+                <w:lang w:val="en-US"/>
+              </w:rPr>
+            </w:pPr>
+            <w:r>
+              <w:rPr>
+                <w:lang w:val="en-US"/>
+              </w:rPr>
+              <w:t xml:space="preserve">  INDEX `fk_item_inventario_fabricante1_idx` (`id_fabricante` ASC),</w:t>
+            </w:r>
+          </w:p>
+          <w:p>
+            <w:pPr>
+              <w:rPr>
+                <w:lang w:val="en-US"/>
+              </w:rPr>
+            </w:pPr>
+            <w:r>
+              <w:rPr>
+                <w:lang w:val="en-US"/>
+              </w:rPr>
+              <w:t xml:space="preserve">  </w:t>
+            </w:r>
+          </w:p>
+          <w:p>
+            <w:pPr>
+              <w:rPr>
+                <w:lang w:val="en-US"/>
+              </w:rPr>
+            </w:pPr>
+            <w:r>
+              <w:rPr>
+                <w:lang w:val="en-US"/>
+              </w:rPr>
+              <w:t xml:space="preserve">  CONSTRAINT `chk_inventario_stock` CHECK (`stock` &gt;= 0),</w:t>
+            </w:r>
+          </w:p>
+          <w:p>
+            <w:pPr>
+              <w:rPr>
+                <w:lang w:val="en-US"/>
+              </w:rPr>
+            </w:pPr>
+            <w:r>
+              <w:rPr>
+                <w:lang w:val="en-US"/>
+              </w:rPr>
+              <w:t xml:space="preserve">  CONSTRAINT `chk_inventario_costo` CHECK (`costo_alquiler` &gt;= 0),</w:t>
+            </w:r>
+          </w:p>
+          <w:p>
+            <w:pPr>
+              <w:rPr>
+                <w:lang w:val="en-US"/>
+              </w:rPr>
+            </w:pPr>
+          </w:p>
+          <w:p>
+            <w:pPr>
+              <w:rPr>
+                <w:lang w:val="en-US"/>
+              </w:rPr>
+            </w:pPr>
+            <w:r>
+              <w:rPr>
+                <w:lang w:val="en-US"/>
+              </w:rPr>
+              <w:t xml:space="preserve">  CONSTRAINT `fk_id_categoria` FOREIGN KEY (`id_categoria`)</w:t>
+            </w:r>
+          </w:p>
+          <w:p>
+            <w:r>
+              <w:rPr>
+                <w:lang w:val="en-US"/>
+              </w:rPr>
+              <w:t xml:space="preserve">    </w:t>
+            </w:r>
+            <w:r>
+              <w:t>REFERENCES `salas_de_ensayo_</w:t>
+            </w:r>
+            <w:proofErr w:type="spellStart"/>
+            <w:r>
+              <w:t>db</w:t>
+            </w:r>
+            <w:proofErr w:type="spellEnd"/>
+            <w:r>
+              <w:t>`.`</w:t>
+            </w:r>
+            <w:proofErr w:type="spellStart"/>
+            <w:r>
+              <w:t>categoria</w:t>
+            </w:r>
+            <w:proofErr w:type="spellEnd"/>
+            <w:r>
+              <w:t>` (`id`)</w:t>
+            </w:r>
+          </w:p>
+          <w:p>
+            <w:pPr>
+              <w:rPr>
+                <w:lang w:val="en-US"/>
+              </w:rPr>
+            </w:pPr>
+            <w:r>
+              <w:t xml:space="preserve">    </w:t>
+            </w:r>
+            <w:r>
+              <w:rPr>
+                <w:lang w:val="en-US"/>
+              </w:rPr>
+              <w:t>ON DELETE NO ACTION ON UPDATE CASCADE,</w:t>
+            </w:r>
+          </w:p>
+          <w:p>
+            <w:pPr>
+              <w:rPr>
+                <w:lang w:val="en-US"/>
+              </w:rPr>
+            </w:pPr>
+          </w:p>
+          <w:p>
+            <w:pPr>
+              <w:rPr>
+                <w:lang w:val="en-US"/>
+              </w:rPr>
+            </w:pPr>
+            <w:r>
+              <w:rPr>
+                <w:lang w:val="en-US"/>
+              </w:rPr>
+              <w:t xml:space="preserve">  CONSTRAINT `fk_id_fabricante` FOREIGN KEY (`id_fabricante`)</w:t>
+            </w:r>
+          </w:p>
+          <w:p>
+            <w:r>
+              <w:rPr>
+                <w:lang w:val="en-US"/>
+              </w:rPr>
+              <w:t xml:space="preserve">    </w:t>
+            </w:r>
+            <w:r>
+              <w:t>REFERENCES `salas_de_ensayo_</w:t>
+            </w:r>
+            <w:proofErr w:type="spellStart"/>
+            <w:r>
+              <w:t>db</w:t>
+            </w:r>
+            <w:proofErr w:type="spellEnd"/>
+            <w:r>
+              <w:t>`.`fabricante` (`id`)</w:t>
+            </w:r>
+          </w:p>
+          <w:p>
+            <w:pPr>
+              <w:rPr>
+                <w:lang w:val="en-US"/>
+              </w:rPr>
+            </w:pPr>
+            <w:r>
+              <w:t xml:space="preserve">    </w:t>
+            </w:r>
+            <w:r>
+              <w:rPr>
+                <w:lang w:val="en-US"/>
+              </w:rPr>
+              <w:t>ON DELETE NO ACTION ON UPDATE CASCADE</w:t>
+            </w:r>
+          </w:p>
+          <w:p>
+            <w:pPr>
+              <w:rPr>
+                <w:lang w:val="en-US"/>
+              </w:rPr>
+            </w:pPr>
+            <w:r>
+              <w:rPr>
+                <w:lang w:val="en-US"/>
+              </w:rPr>
+              <w:t>) ENGINE = InnoDB;</w:t>
+            </w:r>
+          </w:p>
+          <w:p>
+            <w:pPr>
+              <w:rPr>
+                <w:lang w:val="en-US"/>
+              </w:rPr>
+            </w:pPr>
+          </w:p>
+          <w:p>
+            <w:pPr>
+              <w:rPr>
+                <w:lang w:val="en-US"/>
+              </w:rPr>
+            </w:pPr>
+          </w:p>
+          <w:p>
+            <w:pPr>
+              <w:rPr>
+                <w:lang w:val="en-US"/>
+              </w:rPr>
+            </w:pPr>
+            <w:r>
+              <w:rPr>
+                <w:lang w:val="en-US"/>
+              </w:rPr>
+              <w:t>-- -----------------------------------------------------</w:t>
+            </w:r>
+          </w:p>
+          <w:p>
+            <w:pPr>
+              <w:rPr>
+                <w:lang w:val="en-US"/>
+              </w:rPr>
+            </w:pPr>
+            <w:r>
+              <w:rPr>
+                <w:lang w:val="en-US"/>
+              </w:rPr>
+              <w:t>-- Table `salas_de_ensayo_db`.`empleado`</w:t>
+            </w:r>
+          </w:p>
+          <w:p>
+            <w:pPr>
+              <w:rPr>
+                <w:lang w:val="en-US"/>
+              </w:rPr>
+            </w:pPr>
+            <w:r>
+              <w:rPr>
+                <w:lang w:val="en-US"/>
+              </w:rPr>
+              <w:t>-- -----------------------------------------------------</w:t>
+            </w:r>
+          </w:p>
+          <w:p>
+            <w:pPr>
+              <w:rPr>
+                <w:lang w:val="en-US"/>
+              </w:rPr>
+            </w:pPr>
+            <w:r>
+              <w:rPr>
+                <w:lang w:val="en-US"/>
+              </w:rPr>
+              <w:t>CREATE TABLE IF NOT EXISTS `salas_de_ensayo_db`.`empleado`(</w:t>
+            </w:r>
+          </w:p>
+          <w:p>
+            <w:pPr>
+              <w:rPr>
+                <w:lang w:val="en-US"/>
+              </w:rPr>
+            </w:pPr>
+            <w:r>
+              <w:rPr>
+                <w:lang w:val="en-US"/>
+              </w:rPr>
+              <w:lastRenderedPageBreak/>
+              <w:t xml:space="preserve">  `dni_persona` VARCHAR(10) NOT NULL,</w:t>
+            </w:r>
+          </w:p>
+          <w:p>
+            <w:pPr>
+              <w:rPr>
+                <w:lang w:val="en-US"/>
+              </w:rPr>
+            </w:pPr>
+            <w:r>
+              <w:rPr>
+                <w:lang w:val="en-US"/>
+              </w:rPr>
+              <w:t xml:space="preserve">  `legajo` INT NOT NULL AUTO_INCREMENT,</w:t>
+            </w:r>
+          </w:p>
+          <w:p>
+            <w:pPr>
+              <w:rPr>
+                <w:lang w:val="en-US"/>
+              </w:rPr>
+            </w:pPr>
+            <w:r>
+              <w:rPr>
+                <w:lang w:val="en-US"/>
+              </w:rPr>
+              <w:t xml:space="preserve">  `contraseña` VARCHAR(45) NOT NULL DEFAULT 'ar-09/',</w:t>
+            </w:r>
+          </w:p>
+          <w:p>
+            <w:pPr>
+              <w:rPr>
+                <w:lang w:val="en-US"/>
+              </w:rPr>
+            </w:pPr>
+          </w:p>
+          <w:p>
+            <w:r>
+              <w:rPr>
+                <w:lang w:val="en-US"/>
+              </w:rPr>
+              <w:t xml:space="preserve">  </w:t>
+            </w:r>
+            <w:r>
+              <w:t>UNIQUE INDEX `</w:t>
+            </w:r>
+            <w:proofErr w:type="spellStart"/>
+            <w:r>
+              <w:t>legajo_UNIQUE</w:t>
+            </w:r>
+            <w:proofErr w:type="spellEnd"/>
+            <w:r>
+              <w:t>` (`legajo` ASC),</w:t>
+            </w:r>
+          </w:p>
+          <w:p>
+            <w:r>
+              <w:t xml:space="preserve">  PRIMARY KEY (`</w:t>
+            </w:r>
+            <w:proofErr w:type="spellStart"/>
+            <w:r>
+              <w:t>dni_persona</w:t>
+            </w:r>
+            <w:proofErr w:type="spellEnd"/>
+            <w:r>
+              <w:t>`),</w:t>
+            </w:r>
+          </w:p>
+          <w:p>
+            <w:r>
+              <w:t xml:space="preserve">  INDEX `fk_empleado_persona1_idx` (`</w:t>
+            </w:r>
+            <w:proofErr w:type="spellStart"/>
+            <w:r>
+              <w:t>dni_persona</w:t>
+            </w:r>
+            <w:proofErr w:type="spellEnd"/>
+            <w:r>
+              <w:t>` ASC),</w:t>
+            </w:r>
+          </w:p>
+          <w:p>
+            <w:r>
+              <w:t xml:space="preserve">  UNIQUE INDEX `</w:t>
+            </w:r>
+            <w:proofErr w:type="spellStart"/>
+            <w:r>
+              <w:t>dni_persona_UNIQUE</w:t>
+            </w:r>
+            <w:proofErr w:type="spellEnd"/>
+            <w:r>
+              <w:t>` (`</w:t>
+            </w:r>
+            <w:proofErr w:type="spellStart"/>
+            <w:r>
+              <w:t>dni_persona</w:t>
+            </w:r>
+            <w:proofErr w:type="spellEnd"/>
+            <w:r>
+              <w:t>` ASC),</w:t>
+            </w:r>
+          </w:p>
+          <w:p/>
+          <w:p>
+            <w:pPr>
+              <w:rPr>
+                <w:lang w:val="en-US"/>
+              </w:rPr>
+            </w:pPr>
+            <w:r>
+              <w:t xml:space="preserve">  </w:t>
+            </w:r>
+            <w:r>
+              <w:rPr>
+                <w:lang w:val="en-US"/>
+              </w:rPr>
+              <w:t>CONSTRAINT `fk_dni_persona_empleado` FOREIGN KEY (`dni_persona`)</w:t>
+            </w:r>
+          </w:p>
+          <w:p>
+            <w:r>
+              <w:rPr>
+                <w:lang w:val="en-US"/>
+              </w:rPr>
+              <w:t xml:space="preserve">    </w:t>
+            </w:r>
+            <w:r>
+              <w:t>REFERENCES `salas_de_ensayo_</w:t>
+            </w:r>
+            <w:proofErr w:type="spellStart"/>
+            <w:r>
+              <w:t>db</w:t>
+            </w:r>
+            <w:proofErr w:type="spellEnd"/>
+            <w:r>
+              <w:t>`.`persona` (`</w:t>
+            </w:r>
+            <w:proofErr w:type="spellStart"/>
+            <w:r>
+              <w:t>dni</w:t>
+            </w:r>
+            <w:proofErr w:type="spellEnd"/>
+            <w:r>
+              <w:t>`)</w:t>
+            </w:r>
+          </w:p>
+          <w:p>
+            <w:pPr>
+              <w:rPr>
+                <w:lang w:val="en-US"/>
+              </w:rPr>
+            </w:pPr>
+            <w:r>
+              <w:t xml:space="preserve">    </w:t>
+            </w:r>
+            <w:r>
+              <w:rPr>
+                <w:lang w:val="en-US"/>
+              </w:rPr>
+              <w:t>ON DELETE CASCADE ON UPDATE CASCADE</w:t>
+            </w:r>
+          </w:p>
+          <w:p>
+            <w:pPr>
+              <w:rPr>
+                <w:lang w:val="en-US"/>
+              </w:rPr>
+            </w:pPr>
+            <w:r>
+              <w:rPr>
+                <w:lang w:val="en-US"/>
+              </w:rPr>
+              <w:t>) ENGINE = InnoDB;</w:t>
+            </w:r>
+          </w:p>
+          <w:p>
+            <w:pPr>
+              <w:rPr>
+                <w:lang w:val="en-US"/>
+              </w:rPr>
+            </w:pPr>
+          </w:p>
+          <w:p>
+            <w:pPr>
+              <w:rPr>
+                <w:lang w:val="en-US"/>
+              </w:rPr>
+            </w:pPr>
+          </w:p>
+          <w:p>
+            <w:pPr>
+              <w:rPr>
+                <w:lang w:val="en-US"/>
+              </w:rPr>
+            </w:pPr>
+            <w:r>
+              <w:rPr>
+                <w:lang w:val="en-US"/>
+              </w:rPr>
+              <w:t>-- -----------------------------------------------------</w:t>
+            </w:r>
+          </w:p>
+          <w:p>
+            <w:pPr>
+              <w:rPr>
+                <w:lang w:val="en-US"/>
+              </w:rPr>
+            </w:pPr>
+            <w:r>
+              <w:rPr>
+                <w:lang w:val="en-US"/>
+              </w:rPr>
+              <w:t>-- Table `salas_de_ensayo_db`.`pago`</w:t>
+            </w:r>
+          </w:p>
+          <w:p>
+            <w:pPr>
+              <w:rPr>
+                <w:lang w:val="en-US"/>
+              </w:rPr>
+            </w:pPr>
+            <w:r>
+              <w:rPr>
+                <w:lang w:val="en-US"/>
+              </w:rPr>
+              <w:t>-- -----------------------------------------------------</w:t>
+            </w:r>
+          </w:p>
+          <w:p>
+            <w:pPr>
+              <w:rPr>
+                <w:lang w:val="en-US"/>
+              </w:rPr>
+            </w:pPr>
+            <w:r>
+              <w:rPr>
+                <w:lang w:val="en-US"/>
+              </w:rPr>
+              <w:t>CREATE TABLE IF NOT EXISTS `salas_de_ensayo_db`.`pago`(</w:t>
+            </w:r>
+          </w:p>
+          <w:p>
+            <w:pPr>
+              <w:rPr>
+                <w:lang w:val="en-US"/>
+              </w:rPr>
+            </w:pPr>
+            <w:r>
+              <w:rPr>
+                <w:lang w:val="en-US"/>
+              </w:rPr>
+              <w:t xml:space="preserve">  `id` BIGINT NOT NULL AUTO_INCREMENT,</w:t>
+            </w:r>
+          </w:p>
+          <w:p>
+            <w:pPr>
+              <w:rPr>
+                <w:lang w:val="en-US"/>
+              </w:rPr>
+            </w:pPr>
+            <w:r>
+              <w:rPr>
+                <w:lang w:val="en-US"/>
+              </w:rPr>
+              <w:t xml:space="preserve">  `fecha` DATE NOT NULL DEFAULT (CURRENT_DATE()),</w:t>
+            </w:r>
+          </w:p>
+          <w:p>
+            <w:r>
+              <w:rPr>
+                <w:lang w:val="en-US"/>
+              </w:rPr>
+              <w:t xml:space="preserve">  </w:t>
+            </w:r>
+            <w:r>
+              <w:t>`monto` DECIMAL(10,2) NOT NULL,</w:t>
+            </w:r>
+          </w:p>
+          <w:p>
+            <w:r>
+              <w:t xml:space="preserve">  `</w:t>
+            </w:r>
+            <w:proofErr w:type="spellStart"/>
+            <w:r>
+              <w:t>medio_de_pago</w:t>
+            </w:r>
+            <w:proofErr w:type="spellEnd"/>
+            <w:r>
+              <w:t>` VARCHAR(45) NOT NULL DEFAULT 'Efectivo',</w:t>
+            </w:r>
+          </w:p>
+          <w:p>
+            <w:pPr>
+              <w:rPr>
+                <w:lang w:val="en-US"/>
+              </w:rPr>
+            </w:pPr>
+            <w:r>
+              <w:t xml:space="preserve">  </w:t>
+            </w:r>
+            <w:r>
+              <w:rPr>
+                <w:lang w:val="en-US"/>
+              </w:rPr>
+              <w:t>`nro_reserva` BIGINT NOT NULL,</w:t>
+            </w:r>
+          </w:p>
+          <w:p>
+            <w:pPr>
+              <w:rPr>
+                <w:lang w:val="en-US"/>
+              </w:rPr>
+            </w:pPr>
+          </w:p>
+          <w:p>
+            <w:r>
+              <w:rPr>
+                <w:lang w:val="en-US"/>
+              </w:rPr>
+              <w:t xml:space="preserve">  </w:t>
+            </w:r>
+            <w:r>
+              <w:t>PRIMARY KEY (`id`),</w:t>
+            </w:r>
+          </w:p>
+          <w:p>
+            <w:r>
+              <w:t xml:space="preserve">  INDEX `fk_pago_reserva1_idx` (`</w:t>
+            </w:r>
+            <w:proofErr w:type="spellStart"/>
+            <w:r>
+              <w:t>nro_reserva</w:t>
+            </w:r>
+            <w:proofErr w:type="spellEnd"/>
+            <w:r>
+              <w:t>` ASC),</w:t>
+            </w:r>
+          </w:p>
+          <w:p>
+            <w:r>
+              <w:t xml:space="preserve">  UNIQUE INDEX `</w:t>
+            </w:r>
+            <w:proofErr w:type="spellStart"/>
+            <w:r>
+              <w:t>reserva_nro_UNIQUE</w:t>
+            </w:r>
+            <w:proofErr w:type="spellEnd"/>
+            <w:r>
+              <w:t>` (`</w:t>
+            </w:r>
+            <w:proofErr w:type="spellStart"/>
+            <w:r>
+              <w:t>nro_reserva</w:t>
+            </w:r>
+            <w:proofErr w:type="spellEnd"/>
+            <w:r>
+              <w:t>` ASC),</w:t>
+            </w:r>
+          </w:p>
+          <w:p/>
+          <w:p>
+            <w:pPr>
+              <w:rPr>
+                <w:lang w:val="en-US"/>
+              </w:rPr>
+            </w:pPr>
+            <w:r>
+              <w:t xml:space="preserve">  </w:t>
+            </w:r>
+            <w:r>
+              <w:rPr>
+                <w:lang w:val="en-US"/>
+              </w:rPr>
+              <w:t>CONSTRAINT `chk_pago_monto` CHECK (`monto` &gt;= 0),</w:t>
+            </w:r>
+          </w:p>
+          <w:p>
+            <w:r>
+              <w:rPr>
+                <w:lang w:val="en-US"/>
+              </w:rPr>
+              <w:t xml:space="preserve">  </w:t>
+            </w:r>
+            <w:r>
+              <w:t>CONSTRAINT `</w:t>
+            </w:r>
+            <w:proofErr w:type="spellStart"/>
+            <w:r>
+              <w:t>chk_pago_medio</w:t>
+            </w:r>
+            <w:proofErr w:type="spellEnd"/>
+            <w:r>
+              <w:t>` CHECK (`</w:t>
+            </w:r>
+            <w:proofErr w:type="spellStart"/>
+            <w:r>
+              <w:t>medio_de_pago</w:t>
+            </w:r>
+            <w:proofErr w:type="spellEnd"/>
+            <w:r>
+              <w:t>` IN</w:t>
+            </w:r>
+          </w:p>
+          <w:p>
+            <w:r>
+              <w:tab/>
+              <w:t>('Efectivo', 'Transferencia', '</w:t>
+            </w:r>
+            <w:proofErr w:type="spellStart"/>
+            <w:r>
+              <w:t>Credito</w:t>
+            </w:r>
+            <w:proofErr w:type="spellEnd"/>
+            <w:r>
+              <w:t>', 'Débito')),</w:t>
+            </w:r>
+          </w:p>
+          <w:p/>
+          <w:p>
+            <w:pPr>
+              <w:rPr>
+                <w:lang w:val="en-US"/>
+              </w:rPr>
+            </w:pPr>
+            <w:r>
+              <w:t xml:space="preserve">  </w:t>
+            </w:r>
+            <w:r>
+              <w:rPr>
+                <w:lang w:val="en-US"/>
+              </w:rPr>
+              <w:t>CONSTRAINT `fk_nro_reserva_pago` FOREIGN KEY (`nro_reserva`)</w:t>
+            </w:r>
+          </w:p>
+          <w:p>
+            <w:r>
+              <w:rPr>
+                <w:lang w:val="en-US"/>
+              </w:rPr>
+              <w:t xml:space="preserve">    </w:t>
+            </w:r>
+            <w:r>
+              <w:t>REFERENCES `salas_de_ensayo_</w:t>
+            </w:r>
+            <w:proofErr w:type="spellStart"/>
+            <w:r>
+              <w:t>db</w:t>
+            </w:r>
+            <w:proofErr w:type="spellEnd"/>
+            <w:r>
+              <w:t>`.`reserva` (`</w:t>
+            </w:r>
+            <w:proofErr w:type="spellStart"/>
+            <w:r>
+              <w:t>nro</w:t>
+            </w:r>
+            <w:proofErr w:type="spellEnd"/>
+            <w:r>
+              <w:t>`)</w:t>
+            </w:r>
+          </w:p>
+          <w:p>
+            <w:pPr>
+              <w:rPr>
+                <w:lang w:val="en-US"/>
+              </w:rPr>
+            </w:pPr>
+            <w:r>
+              <w:t xml:space="preserve">    </w:t>
+            </w:r>
+            <w:r>
+              <w:rPr>
+                <w:lang w:val="en-US"/>
+              </w:rPr>
+              <w:t>ON DELETE NO ACTION ON UPDATE CASCADE</w:t>
+            </w:r>
+          </w:p>
+          <w:p>
+            <w:r>
+              <w:t xml:space="preserve">) ENGINE = </w:t>
+            </w:r>
+            <w:proofErr w:type="spellStart"/>
+            <w:r>
+              <w:t>InnoDB</w:t>
+            </w:r>
+            <w:proofErr w:type="spellEnd"/>
+            <w:r>
               <w:t>;</w:t>
             </w:r>
           </w:p>
-          <w:p>
-            <w:r>
-              <w:rPr>
-                <w:rFonts w:ascii="Consolas" w:eastAsia="Consolas" w:hAnsi="Consolas" w:cs="Consolas"/>
-                <w:sz w:val="20"/>
-                <w:szCs w:val="20"/>
-              </w:rPr>
-              <w:t xml:space="preserve">-- USE </w:t>
+          <w:p/>
+          <w:p/>
+          <w:p>
+            <w:r>
+              <w:t>-- -----------------------------------------------------</w:t>
+            </w:r>
+          </w:p>
+          <w:p>
+            <w:r>
+              <w:t xml:space="preserve">-- </w:t>
             </w:r>
             <w:proofErr w:type="spellStart"/>
             <w:r>
-              <w:rPr>
-                <w:rFonts w:ascii="Consolas" w:eastAsia="Consolas" w:hAnsi="Consolas" w:cs="Consolas"/>
-                <w:sz w:val="20"/>
-                <w:szCs w:val="20"/>
-              </w:rPr>
-              <w:t>nombre_bd</w:t>
+              <w:t>Table</w:t>
             </w:r>
             <w:proofErr w:type="spellEnd"/>
             <w:r>
-              <w:rPr>
-                <w:rFonts w:ascii="Consolas" w:eastAsia="Consolas" w:hAnsi="Consolas" w:cs="Consolas"/>
-                <w:sz w:val="20"/>
-                <w:szCs w:val="20"/>
-              </w:rPr>
-              <w:t>;</w:t>
-            </w:r>
-          </w:p>
-          <w:p>
-            <w:r>
-              <w:rPr>
-                <w:rFonts w:ascii="Consolas" w:eastAsia="Consolas" w:hAnsi="Consolas" w:cs="Consolas"/>
-                <w:sz w:val="20"/>
-                <w:szCs w:val="20"/>
-              </w:rPr>
-              <w:t>-- CREATE TABLE ...</w:t>
-            </w:r>
-          </w:p>
-          <w:p>
-            <w:r>
-              <w:t xml:space="preserve"> </w:t>
-            </w:r>
-          </w:p>
-          <w:p>
-            <w:r>
-              <w:t xml:space="preserve"> </w:t>
-            </w:r>
-          </w:p>
-          <w:p>
-            <w:r>
-              <w:t xml:space="preserve"> </w:t>
-            </w:r>
-          </w:p>
-          <w:p>
-            <w:r>
-              <w:t xml:space="preserve"> </w:t>
-            </w:r>
-          </w:p>
-          <w:p>
-            <w:r>
-              <w:t xml:space="preserve"> </w:t>
-            </w:r>
+              <w:t xml:space="preserve"> `salas_de_ensayo_</w:t>
+            </w:r>
+            <w:proofErr w:type="spellStart"/>
+            <w:r>
+              <w:t>db</w:t>
+            </w:r>
+            <w:proofErr w:type="spellEnd"/>
+            <w:r>
+              <w:t>`.`</w:t>
+            </w:r>
+            <w:proofErr w:type="spellStart"/>
+            <w:r>
+              <w:t>reserva_inventario</w:t>
+            </w:r>
+            <w:proofErr w:type="spellEnd"/>
+            <w:r>
+              <w:t>`</w:t>
+            </w:r>
+          </w:p>
+          <w:p>
+            <w:pPr>
+              <w:rPr>
+                <w:lang w:val="en-US"/>
+              </w:rPr>
+            </w:pPr>
+            <w:r>
+              <w:rPr>
+                <w:lang w:val="en-US"/>
+              </w:rPr>
+              <w:t>-- -----------------------------------------------------</w:t>
+            </w:r>
+          </w:p>
+          <w:p>
+            <w:pPr>
+              <w:rPr>
+                <w:lang w:val="en-US"/>
+              </w:rPr>
+            </w:pPr>
+            <w:r>
+              <w:rPr>
+                <w:lang w:val="en-US"/>
+              </w:rPr>
+              <w:t>CREATE TABLE IF NOT EXISTS `salas_de_ensayo_db`.`reserva_inventario`(</w:t>
+            </w:r>
+          </w:p>
+          <w:p>
+            <w:pPr>
+              <w:rPr>
+                <w:lang w:val="en-US"/>
+              </w:rPr>
+            </w:pPr>
+            <w:r>
+              <w:rPr>
+                <w:lang w:val="en-US"/>
+              </w:rPr>
+              <w:t xml:space="preserve">  `nro` BIGINT NOT NULL AUTO_INCREMENT,</w:t>
+            </w:r>
+          </w:p>
+          <w:p>
+            <w:pPr>
+              <w:rPr>
+                <w:lang w:val="en-US"/>
+              </w:rPr>
+            </w:pPr>
+            <w:r>
+              <w:rPr>
+                <w:lang w:val="en-US"/>
+              </w:rPr>
+              <w:t xml:space="preserve">  `nro_reserva` BIGINT NOT NULL,</w:t>
+            </w:r>
+          </w:p>
+          <w:p>
+            <w:pPr>
+              <w:rPr>
+                <w:lang w:val="en-US"/>
+              </w:rPr>
+            </w:pPr>
+            <w:r>
+              <w:rPr>
+                <w:lang w:val="en-US"/>
+              </w:rPr>
+              <w:t xml:space="preserve">  `id_item_inventario` VARCHAR(10) NOT NULL,</w:t>
+            </w:r>
+          </w:p>
+          <w:p>
+            <w:pPr>
+              <w:rPr>
+                <w:lang w:val="en-US"/>
+              </w:rPr>
+            </w:pPr>
+            <w:r>
+              <w:rPr>
+                <w:lang w:val="en-US"/>
+              </w:rPr>
+              <w:t xml:space="preserve">  `precio_unit` DECIMAL(10,2) NOT NULL,</w:t>
+            </w:r>
+          </w:p>
+          <w:p>
+            <w:pPr>
+              <w:rPr>
+                <w:lang w:val="en-US"/>
+              </w:rPr>
+            </w:pPr>
+            <w:r>
+              <w:rPr>
+                <w:lang w:val="en-US"/>
+              </w:rPr>
+              <w:t xml:space="preserve">  `cantidad` INT NOT NULL,</w:t>
+            </w:r>
+          </w:p>
+          <w:p>
+            <w:pPr>
+              <w:rPr>
+                <w:lang w:val="en-US"/>
+              </w:rPr>
+            </w:pPr>
+          </w:p>
+          <w:p>
+            <w:pPr>
+              <w:rPr>
+                <w:lang w:val="en-US"/>
+              </w:rPr>
+            </w:pPr>
+            <w:r>
+              <w:rPr>
+                <w:lang w:val="en-US"/>
+              </w:rPr>
+              <w:t xml:space="preserve">  PRIMARY KEY (`nro`, `nro_reserva`, `id_item_inventario`),</w:t>
+            </w:r>
+          </w:p>
+          <w:p>
+            <w:pPr>
+              <w:rPr>
+                <w:lang w:val="en-US"/>
+              </w:rPr>
+            </w:pPr>
+            <w:r>
+              <w:rPr>
+                <w:lang w:val="en-US"/>
+              </w:rPr>
+              <w:t xml:space="preserve">  INDEX `fk_reserva_has_item_inventario_item_inventario1_idx` (`id_item_inventario` ASC),</w:t>
+            </w:r>
+          </w:p>
+          <w:p>
+            <w:pPr>
+              <w:rPr>
+                <w:lang w:val="en-US"/>
+              </w:rPr>
+            </w:pPr>
+            <w:r>
+              <w:rPr>
+                <w:lang w:val="en-US"/>
+              </w:rPr>
+              <w:t xml:space="preserve">  INDEX `fk_reserva_has_item_inventario_reserva1_idx` (`nro_reserva` ASC),</w:t>
+            </w:r>
+          </w:p>
+          <w:p>
+            <w:pPr>
+              <w:rPr>
+                <w:lang w:val="en-US"/>
+              </w:rPr>
+            </w:pPr>
+          </w:p>
+          <w:p>
+            <w:pPr>
+              <w:rPr>
+                <w:lang w:val="en-US"/>
+              </w:rPr>
+            </w:pPr>
+            <w:r>
+              <w:rPr>
+                <w:lang w:val="en-US"/>
+              </w:rPr>
+              <w:t xml:space="preserve">  CONSTRAINT `chk_aparta_cantidad` CHECK (`cantidad` &gt; 0),</w:t>
+            </w:r>
+          </w:p>
+          <w:p>
+            <w:pPr>
+              <w:rPr>
+                <w:lang w:val="en-US"/>
+              </w:rPr>
+            </w:pPr>
+            <w:r>
+              <w:rPr>
+                <w:lang w:val="en-US"/>
+              </w:rPr>
+              <w:t xml:space="preserve">  CONSTRAINT `chk_aparta_precio` CHECK (`precio_unit` &gt;= 0),</w:t>
+            </w:r>
+          </w:p>
+          <w:p>
+            <w:pPr>
+              <w:rPr>
+                <w:lang w:val="en-US"/>
+              </w:rPr>
+            </w:pPr>
+          </w:p>
+          <w:p>
+            <w:pPr>
+              <w:rPr>
+                <w:lang w:val="en-US"/>
+              </w:rPr>
+            </w:pPr>
+            <w:r>
+              <w:rPr>
+                <w:lang w:val="en-US"/>
+              </w:rPr>
+              <w:t xml:space="preserve">  CONSTRAINT `fk_nro_reserva` FOREIGN KEY (`nro_reserva`)</w:t>
+            </w:r>
+          </w:p>
+          <w:p>
+            <w:r>
+              <w:rPr>
+                <w:lang w:val="en-US"/>
+              </w:rPr>
+              <w:t xml:space="preserve">    </w:t>
+            </w:r>
+            <w:r>
+              <w:t>REFERENCES `salas_de_ensayo_</w:t>
+            </w:r>
+            <w:proofErr w:type="spellStart"/>
+            <w:r>
+              <w:t>db</w:t>
+            </w:r>
+            <w:proofErr w:type="spellEnd"/>
+            <w:r>
+              <w:t>`.`reserva` (`</w:t>
+            </w:r>
+            <w:proofErr w:type="spellStart"/>
+            <w:r>
+              <w:t>nro</w:t>
+            </w:r>
+            <w:proofErr w:type="spellEnd"/>
+            <w:r>
+              <w:t>`)</w:t>
+            </w:r>
+          </w:p>
+          <w:p>
+            <w:pPr>
+              <w:rPr>
+                <w:lang w:val="en-US"/>
+              </w:rPr>
+            </w:pPr>
+            <w:r>
+              <w:t xml:space="preserve">    </w:t>
+            </w:r>
+            <w:r>
+              <w:rPr>
+                <w:lang w:val="en-US"/>
+              </w:rPr>
+              <w:t>ON DELETE CASCADE ON UPDATE CASCADE,</w:t>
+            </w:r>
+          </w:p>
+          <w:p>
+            <w:pPr>
+              <w:rPr>
+                <w:lang w:val="en-US"/>
+              </w:rPr>
+            </w:pPr>
+          </w:p>
+          <w:p>
+            <w:pPr>
+              <w:rPr>
+                <w:lang w:val="en-US"/>
+              </w:rPr>
+            </w:pPr>
+            <w:r>
+              <w:rPr>
+                <w:lang w:val="en-US"/>
+              </w:rPr>
+              <w:t xml:space="preserve">  CONSTRAINT `fk_id_item_inventario` FOREIGN KEY (`id_item_inventario`)</w:t>
+            </w:r>
+          </w:p>
+          <w:p>
+            <w:r>
+              <w:rPr>
+                <w:lang w:val="en-US"/>
+              </w:rPr>
+              <w:t xml:space="preserve">    </w:t>
+            </w:r>
+            <w:r>
+              <w:t>REFERENCES `salas_de_ensayo_</w:t>
+            </w:r>
+            <w:proofErr w:type="spellStart"/>
+            <w:r>
+              <w:t>db</w:t>
+            </w:r>
+            <w:proofErr w:type="spellEnd"/>
+            <w:r>
+              <w:t>`.`</w:t>
+            </w:r>
+            <w:proofErr w:type="spellStart"/>
+            <w:r>
+              <w:t>item_inventario</w:t>
+            </w:r>
+            <w:proofErr w:type="spellEnd"/>
+            <w:r>
+              <w:t>` (`id`)</w:t>
+            </w:r>
+          </w:p>
+          <w:p>
+            <w:pPr>
+              <w:rPr>
+                <w:lang w:val="en-US"/>
+              </w:rPr>
+            </w:pPr>
+            <w:r>
+              <w:t xml:space="preserve">    </w:t>
+            </w:r>
+            <w:r>
+              <w:rPr>
+                <w:lang w:val="en-US"/>
+              </w:rPr>
+              <w:t>ON DELETE NO ACTION ON UPDATE CASCADE</w:t>
+            </w:r>
+          </w:p>
+          <w:p>
+            <w:pPr>
+              <w:rPr>
+                <w:lang w:val="en-US"/>
+              </w:rPr>
+            </w:pPr>
+            <w:r>
+              <w:rPr>
+                <w:lang w:val="en-US"/>
+              </w:rPr>
+              <w:t>) ENGINE = InnoDB;</w:t>
+            </w:r>
+          </w:p>
+          <w:p>
+            <w:pPr>
+              <w:rPr>
+                <w:lang w:val="en-US"/>
+              </w:rPr>
+            </w:pPr>
+          </w:p>
+          <w:p>
+            <w:pPr>
+              <w:rPr>
+                <w:lang w:val="en-US"/>
+              </w:rPr>
+            </w:pPr>
+          </w:p>
+          <w:p>
+            <w:pPr>
+              <w:rPr>
+                <w:lang w:val="en-US"/>
+              </w:rPr>
+            </w:pPr>
+            <w:r>
+              <w:rPr>
+                <w:lang w:val="en-US"/>
+              </w:rPr>
+              <w:t>-- -----------------------------------------------------</w:t>
+            </w:r>
+          </w:p>
+          <w:p>
+            <w:pPr>
+              <w:rPr>
+                <w:lang w:val="en-US"/>
+              </w:rPr>
+            </w:pPr>
+            <w:r>
+              <w:rPr>
+                <w:lang w:val="en-US"/>
+              </w:rPr>
+              <w:t>-- Table `salas_de_ensayo_db`.`control_inventario`</w:t>
+            </w:r>
+          </w:p>
+          <w:p>
+            <w:pPr>
+              <w:rPr>
+                <w:lang w:val="en-US"/>
+              </w:rPr>
+            </w:pPr>
+            <w:r>
+              <w:rPr>
+                <w:lang w:val="en-US"/>
+              </w:rPr>
+              <w:t>-- -----------------------------------------------------</w:t>
+            </w:r>
+          </w:p>
+          <w:p>
+            <w:pPr>
+              <w:rPr>
+                <w:lang w:val="en-US"/>
+              </w:rPr>
+            </w:pPr>
+            <w:r>
+              <w:rPr>
+                <w:lang w:val="en-US"/>
+              </w:rPr>
+              <w:t>CREATE TABLE IF NOT EXISTS `salas_de_ensayo_db`.`control_inventario`(</w:t>
+            </w:r>
+          </w:p>
+          <w:p>
+            <w:pPr>
+              <w:rPr>
+                <w:lang w:val="en-US"/>
+              </w:rPr>
+            </w:pPr>
+            <w:r>
+              <w:rPr>
+                <w:lang w:val="en-US"/>
+              </w:rPr>
+              <w:t xml:space="preserve">  `nro` INT NOT NULL AUTO_INCREMENT,</w:t>
+            </w:r>
+          </w:p>
+          <w:p>
+            <w:pPr>
+              <w:rPr>
+                <w:lang w:val="en-US"/>
+              </w:rPr>
+            </w:pPr>
+            <w:r>
+              <w:rPr>
+                <w:lang w:val="en-US"/>
+              </w:rPr>
+              <w:t xml:space="preserve">  `dni_empleado` VARCHAR(10) NOT NULL,</w:t>
+            </w:r>
+          </w:p>
+          <w:p>
+            <w:pPr>
+              <w:rPr>
+                <w:lang w:val="en-US"/>
+              </w:rPr>
+            </w:pPr>
+            <w:r>
+              <w:rPr>
+                <w:lang w:val="en-US"/>
+              </w:rPr>
+              <w:t xml:space="preserve">  `id_item_inventario` VARCHAR(10) NOT NULL,</w:t>
+            </w:r>
+          </w:p>
+          <w:p>
+            <w:pPr>
+              <w:rPr>
+                <w:lang w:val="en-US"/>
+              </w:rPr>
+            </w:pPr>
+            <w:r>
+              <w:rPr>
+                <w:lang w:val="en-US"/>
+              </w:rPr>
+              <w:t xml:space="preserve">  `fecha` DATE NULL DEFAULT (CURRENT_DATE()),</w:t>
+            </w:r>
+          </w:p>
+          <w:p>
+            <w:pPr>
+              <w:rPr>
+                <w:lang w:val="en-US"/>
+              </w:rPr>
+            </w:pPr>
+            <w:r>
+              <w:rPr>
+                <w:lang w:val="en-US"/>
+              </w:rPr>
+              <w:t xml:space="preserve">  `observacion` VARCHAR(100) NULL,</w:t>
+            </w:r>
+          </w:p>
+          <w:p>
+            <w:pPr>
+              <w:rPr>
+                <w:lang w:val="en-US"/>
+              </w:rPr>
+            </w:pPr>
+          </w:p>
+          <w:p>
+            <w:pPr>
+              <w:rPr>
+                <w:lang w:val="en-US"/>
+              </w:rPr>
+            </w:pPr>
+            <w:r>
+              <w:rPr>
+                <w:lang w:val="en-US"/>
+              </w:rPr>
+              <w:t xml:space="preserve">  PRIMARY KEY (`nro`, `id_item_inventario`, `dni_empleado`),</w:t>
+            </w:r>
+          </w:p>
+          <w:p>
+            <w:pPr>
+              <w:rPr>
+                <w:lang w:val="en-US"/>
+              </w:rPr>
+            </w:pPr>
+            <w:r>
+              <w:rPr>
+                <w:lang w:val="en-US"/>
+              </w:rPr>
+              <w:t xml:space="preserve">  INDEX `fk_empleado_has_item_inventario_item_inventario1_idx` (`id_item_inventario` ASC),</w:t>
+            </w:r>
+          </w:p>
+          <w:p>
+            <w:r>
+              <w:rPr>
+                <w:lang w:val="en-US"/>
+              </w:rPr>
+              <w:t xml:space="preserve">  </w:t>
+            </w:r>
+            <w:r>
+              <w:t>INDEX `</w:t>
+            </w:r>
+            <w:proofErr w:type="spellStart"/>
+            <w:r>
+              <w:t>fk_empleado_idx</w:t>
+            </w:r>
+            <w:proofErr w:type="spellEnd"/>
+            <w:r>
+              <w:t>` (`</w:t>
+            </w:r>
+            <w:proofErr w:type="spellStart"/>
+            <w:r>
+              <w:t>dni_empleado</w:t>
+            </w:r>
+            <w:proofErr w:type="spellEnd"/>
+            <w:r>
+              <w:t>` ASC),</w:t>
+            </w:r>
+          </w:p>
+          <w:p/>
+          <w:p>
+            <w:pPr>
+              <w:rPr>
+                <w:lang w:val="en-US"/>
+              </w:rPr>
+            </w:pPr>
+            <w:r>
+              <w:t xml:space="preserve">  </w:t>
+            </w:r>
+            <w:r>
+              <w:rPr>
+                <w:lang w:val="en-US"/>
+              </w:rPr>
+              <w:t>CONSTRAINT `fk_id_item_inventario_control` FOREIGN KEY (`id_item_inventario`)</w:t>
+            </w:r>
+          </w:p>
+          <w:p>
+            <w:r>
+              <w:rPr>
+                <w:lang w:val="en-US"/>
+              </w:rPr>
+              <w:t xml:space="preserve">    </w:t>
+            </w:r>
+            <w:r>
+              <w:t>REFERENCES `salas_de_ensayo_</w:t>
+            </w:r>
+            <w:proofErr w:type="spellStart"/>
+            <w:r>
+              <w:t>db</w:t>
+            </w:r>
+            <w:proofErr w:type="spellEnd"/>
+            <w:r>
+              <w:t>`.`</w:t>
+            </w:r>
+            <w:proofErr w:type="spellStart"/>
+            <w:r>
+              <w:t>item_inventario</w:t>
+            </w:r>
+            <w:proofErr w:type="spellEnd"/>
+            <w:r>
+              <w:t>` (`id`)</w:t>
+            </w:r>
+          </w:p>
+          <w:p>
+            <w:pPr>
+              <w:rPr>
+                <w:lang w:val="en-US"/>
+              </w:rPr>
+            </w:pPr>
+            <w:r>
+              <w:t xml:space="preserve">    </w:t>
+            </w:r>
+            <w:r>
+              <w:rPr>
+                <w:lang w:val="en-US"/>
+              </w:rPr>
+              <w:t>ON DELETE CASCADE ON UPDATE CASCADE,</w:t>
+            </w:r>
+          </w:p>
+          <w:p>
+            <w:pPr>
+              <w:rPr>
+                <w:lang w:val="en-US"/>
+              </w:rPr>
+            </w:pPr>
+          </w:p>
+          <w:p>
+            <w:pPr>
+              <w:rPr>
+                <w:lang w:val="en-US"/>
+              </w:rPr>
+            </w:pPr>
+            <w:r>
+              <w:rPr>
+                <w:lang w:val="en-US"/>
+              </w:rPr>
+              <w:t xml:space="preserve">  CONSTRAINT `fk_dni_empleado` FOREIGN KEY (`dni_empleado`)</w:t>
+            </w:r>
+          </w:p>
+          <w:p>
+            <w:r>
+              <w:rPr>
+                <w:lang w:val="en-US"/>
+              </w:rPr>
+              <w:t xml:space="preserve">    </w:t>
+            </w:r>
+            <w:r>
+              <w:t>REFERENCES `salas_de_ensayo_</w:t>
+            </w:r>
+            <w:proofErr w:type="spellStart"/>
+            <w:r>
+              <w:t>db</w:t>
+            </w:r>
+            <w:proofErr w:type="spellEnd"/>
+            <w:r>
+              <w:t>`.`empleado` (`</w:t>
+            </w:r>
+            <w:proofErr w:type="spellStart"/>
+            <w:r>
+              <w:t>dni_persona</w:t>
+            </w:r>
+            <w:proofErr w:type="spellEnd"/>
+            <w:r>
+              <w:t>`)</w:t>
+            </w:r>
+          </w:p>
+          <w:p>
+            <w:pPr>
+              <w:rPr>
+                <w:lang w:val="en-US"/>
+              </w:rPr>
+            </w:pPr>
+            <w:r>
+              <w:t xml:space="preserve">    </w:t>
+            </w:r>
+            <w:r>
+              <w:rPr>
+                <w:lang w:val="en-US"/>
+              </w:rPr>
+              <w:t>ON DELETE CASCADE ON UPDATE CASCADE</w:t>
+            </w:r>
+          </w:p>
+          <w:p>
+            <w:pPr>
+              <w:rPr>
+                <w:lang w:val="en-US"/>
+              </w:rPr>
+            </w:pPr>
+            <w:r>
+              <w:rPr>
+                <w:lang w:val="en-US"/>
+              </w:rPr>
+              <w:t>) ENGINE = InnoDB;</w:t>
+            </w:r>
+          </w:p>
+          <w:p>
+            <w:pPr>
+              <w:rPr>
+                <w:lang w:val="en-US"/>
+              </w:rPr>
+            </w:pPr>
+          </w:p>
+          <w:p>
+            <w:pPr>
+              <w:rPr>
+                <w:lang w:val="en-US"/>
+              </w:rPr>
+            </w:pPr>
+          </w:p>
+          <w:p>
+            <w:pPr>
+              <w:rPr>
+                <w:lang w:val="en-US"/>
+              </w:rPr>
+            </w:pPr>
+            <w:r>
+              <w:rPr>
+                <w:lang w:val="en-US"/>
+              </w:rPr>
+              <w:t>SET SQL_MODE=@OLD_SQL_MODE;</w:t>
+            </w:r>
+          </w:p>
+          <w:p>
+            <w:pPr>
+              <w:rPr>
+                <w:lang w:val="en-US"/>
+              </w:rPr>
+            </w:pPr>
+            <w:r>
+              <w:rPr>
+                <w:lang w:val="en-US"/>
+              </w:rPr>
+              <w:t>SET FOREIGN_KEY_CHECKS=@OLD_FOREIGN_KEY_CHECKS;</w:t>
+            </w:r>
+          </w:p>
+          <w:p>
+            <w:pPr>
+              <w:rPr>
+                <w:lang w:val="en-US"/>
+              </w:rPr>
+            </w:pPr>
+            <w:r>
+              <w:rPr>
+                <w:lang w:val="en-US"/>
+              </w:rPr>
+              <w:t>SET UNIQUE_CHECKS=@OLD_UNIQUE_CHECKS;</w:t>
+            </w:r>
+            <w:bookmarkStart w:id="28" w:name="_GoBack"/>
+            <w:bookmarkEnd w:id="28"/>
           </w:p>
         </w:tc>
       </w:tr>
     </w:tbl>
     <w:p>
-      <w:r>
+      <w:pPr>
+        <w:rPr>
+          <w:lang w:val="en-US"/>
+        </w:rPr>
+      </w:pPr>
+      <w:r>
+        <w:rPr>
+          <w:lang w:val="en-US"/>
+        </w:rPr>
+        <w:lastRenderedPageBreak/>
         <w:br w:type="page"/>
       </w:r>
     </w:p>
@@ -8934,7 +11621,7 @@
         <w:sz w:val="18"/>
         <w:szCs w:val="18"/>
       </w:rPr>
-      <w:t>9</w:t>
+      <w:t>12</w:t>
     </w:r>
     <w:r>
       <w:rPr>
@@ -8983,7 +11670,7 @@
         <w:sz w:val="18"/>
         <w:szCs w:val="18"/>
       </w:rPr>
-      <w:t>14</w:t>
+      <w:t>18</w:t>
     </w:r>
     <w:r>
       <w:rPr>
@@ -10252,7 +12939,7 @@
   <a:extraClrSchemeLst/>
   <a:extLst>
     <a:ext uri="{05A4C25C-085E-4340-85A3-A5531E510DB2}">
-      <thm15:themeFamily xmlns="" xmlns:thm15="http://schemas.microsoft.com/office/thememl/2012/main" name="Office Theme" id="{62F939B6-93AF-4DB8-9C6B-D6C7DFDC589F}" vid="{4A3C46E8-61CC-4603-A589-7422A47A8E4A}"/>
+      <thm15:themeFamily xmlns:thm15="http://schemas.microsoft.com/office/thememl/2012/main" xmlns="" name="Office Theme" id="{62F939B6-93AF-4DB8-9C6B-D6C7DFDC589F}" vid="{4A3C46E8-61CC-4603-A589-7422A47A8E4A}"/>
     </a:ext>
   </a:extLst>
 </a:theme>

</xml_diff>